<commit_message>
Improve training pipeline and refresh project artifacts
</commit_message>
<xml_diff>
--- a/Quantyze_Class_Reference.docx
+++ b/Quantyze_Class_Reference.docx
@@ -76,7 +76,7 @@
           <w:color w:val="555555"/>
           <w:sz w:val="20"/>
         </w:rPr>
-        <w:t>Defines the two fundamental data structures that flow through every other module: Event (raw market instruction) and Order (a resting or active order in the book).</w:t>
+        <w:t>Defines four classes used throughout the system: Event (raw market instruction), BaseOrder (shared executable-order state), IncomingOrder (mutable order during matching), and Order (resting limit order in the book). Order and IncomingOrder both extend BaseOrder.</w:t>
       </w:r>
     </w:p>
     <w:p>
@@ -100,7 +100,7 @@
           <w:color w:val="555555"/>
           <w:sz w:val="20"/>
         </w:rPr>
-        <w:t xml:space="preserve">  —  Event and Order dataclasses; the canonical data contract for the whole system</w:t>
+        <w:t xml:space="preserve">  —  Event, BaseOrder, IncomingOrder, Order — the canonical data contract for the whole system</w:t>
       </w:r>
     </w:p>
     <w:tbl>
@@ -486,7 +486,7 @@
                 <w:color w:val="555555"/>
                 <w:sz w:val="18"/>
               </w:rPr>
-              <w:t>'limit' or 'market' — determines matching behaviour</w:t>
+              <w:t>'limit', 'market', or 'cancel' — determines matching behaviour</w:t>
             </w:r>
           </w:p>
         </w:tc>
@@ -2121,6 +2121,1412 @@
                 <w:sz w:val="18"/>
               </w:rPr>
               <w:t>Serialises for log.json entry</w:t>
+            </w:r>
+          </w:p>
+        </w:tc>
+      </w:tr>
+    </w:tbl>
+    <w:p>
+      <w:pPr>
+        <w:spacing w:after="40"/>
+      </w:pPr>
+    </w:p>
+    <w:p>
+      <w:pPr>
+        <w:spacing w:after="160"/>
+      </w:pPr>
+    </w:p>
+    <w:tbl>
+      <w:tblPr>
+        <w:tblStyle w:val="TableGrid"/>
+        <w:tblW w:w="0" w:type="auto"/>
+        <w:tblLook w:val="04A0" w:firstRow="1" w:lastRow="0" w:firstColumn="1" w:lastColumn="0" w:noHBand="0" w:noVBand="1"/>
+      </w:tblPr>
+      <w:tblGrid>
+        <w:gridCol w:w="9360"/>
+      </w:tblGrid>
+      <w:tr>
+        <w:tc>
+          <w:tcPr>
+            <w:tcW w:w="9360" w:type="dxa"/>
+            <w:tcBorders>
+              <w:top w:val="single" w:sz="6" w:space="0" w:color="378ADD"/>
+              <w:left w:val="single" w:sz="6" w:space="0" w:color="378ADD"/>
+              <w:bottom w:val="single" w:sz="6" w:space="0" w:color="378ADD"/>
+              <w:right w:val="single" w:sz="6" w:space="0" w:color="378ADD"/>
+            </w:tcBorders>
+            <w:shd w:val="clear" w:color="auto" w:fill="E6F1FB"/>
+          </w:tcPr>
+          <w:p>
+            <w:pPr>
+              <w:spacing w:before="80" w:after="80"/>
+            </w:pPr>
+            <w:r>
+              <w:rPr>
+                <w:rFonts w:ascii="Courier New" w:hAnsi="Courier New"/>
+                <w:b/>
+                <w:color w:val="042C53"/>
+              </w:rPr>
+              <w:t>class  BaseOrder</w:t>
+            </w:r>
+            <w:r>
+              <w:rPr>
+                <w:rFonts w:ascii="Arial" w:hAnsi="Arial"/>
+                <w:i/>
+                <w:color w:val="185FA5"/>
+                <w:sz w:val="20"/>
+              </w:rPr>
+              <w:t xml:space="preserve">    — shared executable-order state; parent of Order and IncomingOrder</w:t>
+            </w:r>
+          </w:p>
+        </w:tc>
+      </w:tr>
+    </w:tbl>
+    <w:p>
+      <w:pPr>
+        <w:spacing w:after="60"/>
+      </w:pPr>
+    </w:p>
+    <w:p>
+      <w:pPr>
+        <w:spacing w:before="120" w:after="40"/>
+      </w:pPr>
+      <w:r>
+        <w:rPr>
+          <w:rFonts w:ascii="Arial" w:hAnsi="Arial"/>
+          <w:b/>
+          <w:color w:val="185FA5"/>
+          <w:sz w:val="18"/>
+        </w:rPr>
+        <w:t>Attributes</w:t>
+      </w:r>
+    </w:p>
+    <w:tbl>
+      <w:tblPr>
+        <w:tblStyle w:val="TableGrid"/>
+        <w:tblW w:w="0" w:type="auto"/>
+        <w:tblLook w:val="04A0" w:firstRow="1" w:lastRow="0" w:firstColumn="1" w:lastColumn="0" w:noHBand="0" w:noVBand="1"/>
+      </w:tblPr>
+      <w:tblGrid>
+        <w:gridCol w:w="2736"/>
+        <w:gridCol w:w="2736"/>
+        <w:gridCol w:w="3888"/>
+      </w:tblGrid>
+      <w:tr>
+        <w:tc>
+          <w:tcPr>
+            <w:tcW w:w="2736" w:type="dxa"/>
+            <w:tcBorders>
+              <w:top w:val="single" w:sz="2" w:space="0" w:color="CCCCCC"/>
+              <w:left w:val="single" w:sz="2" w:space="0" w:color="CCCCCC"/>
+              <w:bottom w:val="single" w:sz="2" w:space="0" w:color="CCCCCC"/>
+              <w:right w:val="single" w:sz="2" w:space="0" w:color="CCCCCC"/>
+            </w:tcBorders>
+            <w:shd w:val="clear" w:color="auto" w:fill="E6F1FB"/>
+          </w:tcPr>
+          <w:p>
+            <w:pPr>
+              <w:spacing w:before="60" w:after="60"/>
+            </w:pPr>
+            <w:r>
+              <w:rPr>
+                <w:rFonts w:ascii="Courier New" w:hAnsi="Courier New"/>
+                <w:b/>
+                <w:color w:val="042C53"/>
+                <w:sz w:val="18"/>
+              </w:rPr>
+              <w:t>order_id</w:t>
+            </w:r>
+          </w:p>
+        </w:tc>
+        <w:tc>
+          <w:tcPr>
+            <w:tcW w:w="2736" w:type="dxa"/>
+            <w:tcBorders>
+              <w:top w:val="single" w:sz="2" w:space="0" w:color="CCCCCC"/>
+              <w:left w:val="single" w:sz="2" w:space="0" w:color="CCCCCC"/>
+              <w:bottom w:val="single" w:sz="2" w:space="0" w:color="CCCCCC"/>
+              <w:right w:val="single" w:sz="2" w:space="0" w:color="CCCCCC"/>
+            </w:tcBorders>
+            <w:shd w:val="clear" w:color="auto" w:fill="FFFFFF"/>
+          </w:tcPr>
+          <w:p>
+            <w:pPr>
+              <w:spacing w:before="60" w:after="60"/>
+            </w:pPr>
+            <w:r>
+              <w:rPr>
+                <w:rFonts w:ascii="Courier New" w:hAnsi="Courier New"/>
+                <w:color w:val="3B6D11"/>
+                <w:sz w:val="16"/>
+              </w:rPr>
+              <w:t>str</w:t>
+            </w:r>
+          </w:p>
+        </w:tc>
+        <w:tc>
+          <w:tcPr>
+            <w:tcW w:w="3888" w:type="dxa"/>
+            <w:tcBorders>
+              <w:top w:val="single" w:sz="2" w:space="0" w:color="CCCCCC"/>
+              <w:left w:val="single" w:sz="2" w:space="0" w:color="CCCCCC"/>
+              <w:bottom w:val="single" w:sz="2" w:space="0" w:color="CCCCCC"/>
+              <w:right w:val="single" w:sz="2" w:space="0" w:color="CCCCCC"/>
+            </w:tcBorders>
+            <w:shd w:val="clear" w:color="auto" w:fill="FFFFFF"/>
+          </w:tcPr>
+          <w:p>
+            <w:pPr>
+              <w:spacing w:before="60" w:after="60"/>
+            </w:pPr>
+            <w:r>
+              <w:rPr>
+                <w:rFonts w:ascii="Arial" w:hAnsi="Arial"/>
+                <w:color w:val="555555"/>
+                <w:sz w:val="18"/>
+              </w:rPr>
+              <w:t>Unique identifier copied from event</w:t>
+            </w:r>
+          </w:p>
+        </w:tc>
+      </w:tr>
+      <w:tr>
+        <w:tc>
+          <w:tcPr>
+            <w:tcW w:w="2736" w:type="dxa"/>
+            <w:tcBorders>
+              <w:top w:val="single" w:sz="2" w:space="0" w:color="CCCCCC"/>
+              <w:left w:val="single" w:sz="2" w:space="0" w:color="CCCCCC"/>
+              <w:bottom w:val="single" w:sz="2" w:space="0" w:color="CCCCCC"/>
+              <w:right w:val="single" w:sz="2" w:space="0" w:color="CCCCCC"/>
+            </w:tcBorders>
+            <w:shd w:val="clear" w:color="auto" w:fill="E6F1FB"/>
+          </w:tcPr>
+          <w:p>
+            <w:pPr>
+              <w:spacing w:before="60" w:after="60"/>
+            </w:pPr>
+            <w:r>
+              <w:rPr>
+                <w:rFonts w:ascii="Courier New" w:hAnsi="Courier New"/>
+                <w:b/>
+                <w:color w:val="042C53"/>
+                <w:sz w:val="18"/>
+              </w:rPr>
+              <w:t>side</w:t>
+            </w:r>
+          </w:p>
+        </w:tc>
+        <w:tc>
+          <w:tcPr>
+            <w:tcW w:w="2736" w:type="dxa"/>
+            <w:tcBorders>
+              <w:top w:val="single" w:sz="2" w:space="0" w:color="CCCCCC"/>
+              <w:left w:val="single" w:sz="2" w:space="0" w:color="CCCCCC"/>
+              <w:bottom w:val="single" w:sz="2" w:space="0" w:color="CCCCCC"/>
+              <w:right w:val="single" w:sz="2" w:space="0" w:color="CCCCCC"/>
+            </w:tcBorders>
+            <w:shd w:val="clear" w:color="auto" w:fill="FFFFFF"/>
+          </w:tcPr>
+          <w:p>
+            <w:pPr>
+              <w:spacing w:before="60" w:after="60"/>
+            </w:pPr>
+            <w:r>
+              <w:rPr>
+                <w:rFonts w:ascii="Courier New" w:hAnsi="Courier New"/>
+                <w:color w:val="3B6D11"/>
+                <w:sz w:val="16"/>
+              </w:rPr>
+              <w:t>str</w:t>
+            </w:r>
+          </w:p>
+        </w:tc>
+        <w:tc>
+          <w:tcPr>
+            <w:tcW w:w="3888" w:type="dxa"/>
+            <w:tcBorders>
+              <w:top w:val="single" w:sz="2" w:space="0" w:color="CCCCCC"/>
+              <w:left w:val="single" w:sz="2" w:space="0" w:color="CCCCCC"/>
+              <w:bottom w:val="single" w:sz="2" w:space="0" w:color="CCCCCC"/>
+              <w:right w:val="single" w:sz="2" w:space="0" w:color="CCCCCC"/>
+            </w:tcBorders>
+            <w:shd w:val="clear" w:color="auto" w:fill="FFFFFF"/>
+          </w:tcPr>
+          <w:p>
+            <w:pPr>
+              <w:spacing w:before="60" w:after="60"/>
+            </w:pPr>
+            <w:r>
+              <w:rPr>
+                <w:rFonts w:ascii="Arial" w:hAnsi="Arial"/>
+                <w:color w:val="555555"/>
+                <w:sz w:val="18"/>
+              </w:rPr>
+              <w:t>'bid' or 'ask'</w:t>
+            </w:r>
+          </w:p>
+        </w:tc>
+      </w:tr>
+      <w:tr>
+        <w:tc>
+          <w:tcPr>
+            <w:tcW w:w="2736" w:type="dxa"/>
+            <w:tcBorders>
+              <w:top w:val="single" w:sz="2" w:space="0" w:color="CCCCCC"/>
+              <w:left w:val="single" w:sz="2" w:space="0" w:color="CCCCCC"/>
+              <w:bottom w:val="single" w:sz="2" w:space="0" w:color="CCCCCC"/>
+              <w:right w:val="single" w:sz="2" w:space="0" w:color="CCCCCC"/>
+            </w:tcBorders>
+            <w:shd w:val="clear" w:color="auto" w:fill="E6F1FB"/>
+          </w:tcPr>
+          <w:p>
+            <w:pPr>
+              <w:spacing w:before="60" w:after="60"/>
+            </w:pPr>
+            <w:r>
+              <w:rPr>
+                <w:rFonts w:ascii="Courier New" w:hAnsi="Courier New"/>
+                <w:b/>
+                <w:color w:val="042C53"/>
+                <w:sz w:val="18"/>
+              </w:rPr>
+              <w:t>price</w:t>
+            </w:r>
+          </w:p>
+        </w:tc>
+        <w:tc>
+          <w:tcPr>
+            <w:tcW w:w="2736" w:type="dxa"/>
+            <w:tcBorders>
+              <w:top w:val="single" w:sz="2" w:space="0" w:color="CCCCCC"/>
+              <w:left w:val="single" w:sz="2" w:space="0" w:color="CCCCCC"/>
+              <w:bottom w:val="single" w:sz="2" w:space="0" w:color="CCCCCC"/>
+              <w:right w:val="single" w:sz="2" w:space="0" w:color="CCCCCC"/>
+            </w:tcBorders>
+            <w:shd w:val="clear" w:color="auto" w:fill="FFFFFF"/>
+          </w:tcPr>
+          <w:p>
+            <w:pPr>
+              <w:spacing w:before="60" w:after="60"/>
+            </w:pPr>
+            <w:r>
+              <w:rPr>
+                <w:rFonts w:ascii="Courier New" w:hAnsi="Courier New"/>
+                <w:color w:val="3B6D11"/>
+                <w:sz w:val="16"/>
+              </w:rPr>
+              <w:t>float | None</w:t>
+            </w:r>
+          </w:p>
+        </w:tc>
+        <w:tc>
+          <w:tcPr>
+            <w:tcW w:w="3888" w:type="dxa"/>
+            <w:tcBorders>
+              <w:top w:val="single" w:sz="2" w:space="0" w:color="CCCCCC"/>
+              <w:left w:val="single" w:sz="2" w:space="0" w:color="CCCCCC"/>
+              <w:bottom w:val="single" w:sz="2" w:space="0" w:color="CCCCCC"/>
+              <w:right w:val="single" w:sz="2" w:space="0" w:color="CCCCCC"/>
+            </w:tcBorders>
+            <w:shd w:val="clear" w:color="auto" w:fill="FFFFFF"/>
+          </w:tcPr>
+          <w:p>
+            <w:pPr>
+              <w:spacing w:before="60" w:after="60"/>
+            </w:pPr>
+            <w:r>
+              <w:rPr>
+                <w:rFonts w:ascii="Arial" w:hAnsi="Arial"/>
+                <w:color w:val="555555"/>
+                <w:sz w:val="18"/>
+              </w:rPr>
+              <w:t>None for market orders</w:t>
+            </w:r>
+          </w:p>
+        </w:tc>
+      </w:tr>
+      <w:tr>
+        <w:tc>
+          <w:tcPr>
+            <w:tcW w:w="2736" w:type="dxa"/>
+            <w:tcBorders>
+              <w:top w:val="single" w:sz="2" w:space="0" w:color="CCCCCC"/>
+              <w:left w:val="single" w:sz="2" w:space="0" w:color="CCCCCC"/>
+              <w:bottom w:val="single" w:sz="2" w:space="0" w:color="CCCCCC"/>
+              <w:right w:val="single" w:sz="2" w:space="0" w:color="CCCCCC"/>
+            </w:tcBorders>
+            <w:shd w:val="clear" w:color="auto" w:fill="E6F1FB"/>
+          </w:tcPr>
+          <w:p>
+            <w:pPr>
+              <w:spacing w:before="60" w:after="60"/>
+            </w:pPr>
+            <w:r>
+              <w:rPr>
+                <w:rFonts w:ascii="Courier New" w:hAnsi="Courier New"/>
+                <w:b/>
+                <w:color w:val="042C53"/>
+                <w:sz w:val="18"/>
+              </w:rPr>
+              <w:t>quantity</w:t>
+            </w:r>
+          </w:p>
+        </w:tc>
+        <w:tc>
+          <w:tcPr>
+            <w:tcW w:w="2736" w:type="dxa"/>
+            <w:tcBorders>
+              <w:top w:val="single" w:sz="2" w:space="0" w:color="CCCCCC"/>
+              <w:left w:val="single" w:sz="2" w:space="0" w:color="CCCCCC"/>
+              <w:bottom w:val="single" w:sz="2" w:space="0" w:color="CCCCCC"/>
+              <w:right w:val="single" w:sz="2" w:space="0" w:color="CCCCCC"/>
+            </w:tcBorders>
+            <w:shd w:val="clear" w:color="auto" w:fill="FFFFFF"/>
+          </w:tcPr>
+          <w:p>
+            <w:pPr>
+              <w:spacing w:before="60" w:after="60"/>
+            </w:pPr>
+            <w:r>
+              <w:rPr>
+                <w:rFonts w:ascii="Courier New" w:hAnsi="Courier New"/>
+                <w:color w:val="3B6D11"/>
+                <w:sz w:val="16"/>
+              </w:rPr>
+              <w:t>float</w:t>
+            </w:r>
+          </w:p>
+        </w:tc>
+        <w:tc>
+          <w:tcPr>
+            <w:tcW w:w="3888" w:type="dxa"/>
+            <w:tcBorders>
+              <w:top w:val="single" w:sz="2" w:space="0" w:color="CCCCCC"/>
+              <w:left w:val="single" w:sz="2" w:space="0" w:color="CCCCCC"/>
+              <w:bottom w:val="single" w:sz="2" w:space="0" w:color="CCCCCC"/>
+              <w:right w:val="single" w:sz="2" w:space="0" w:color="CCCCCC"/>
+            </w:tcBorders>
+            <w:shd w:val="clear" w:color="auto" w:fill="FFFFFF"/>
+          </w:tcPr>
+          <w:p>
+            <w:pPr>
+              <w:spacing w:before="60" w:after="60"/>
+            </w:pPr>
+            <w:r>
+              <w:rPr>
+                <w:rFonts w:ascii="Arial" w:hAnsi="Arial"/>
+                <w:color w:val="555555"/>
+                <w:sz w:val="18"/>
+              </w:rPr>
+              <w:t>Original order size</w:t>
+            </w:r>
+          </w:p>
+        </w:tc>
+      </w:tr>
+      <w:tr>
+        <w:tc>
+          <w:tcPr>
+            <w:tcW w:w="2736" w:type="dxa"/>
+            <w:tcBorders>
+              <w:top w:val="single" w:sz="2" w:space="0" w:color="CCCCCC"/>
+              <w:left w:val="single" w:sz="2" w:space="0" w:color="CCCCCC"/>
+              <w:bottom w:val="single" w:sz="2" w:space="0" w:color="CCCCCC"/>
+              <w:right w:val="single" w:sz="2" w:space="0" w:color="CCCCCC"/>
+            </w:tcBorders>
+            <w:shd w:val="clear" w:color="auto" w:fill="E6F1FB"/>
+          </w:tcPr>
+          <w:p>
+            <w:pPr>
+              <w:spacing w:before="60" w:after="60"/>
+            </w:pPr>
+            <w:r>
+              <w:rPr>
+                <w:rFonts w:ascii="Courier New" w:hAnsi="Courier New"/>
+                <w:b/>
+                <w:color w:val="042C53"/>
+                <w:sz w:val="18"/>
+              </w:rPr>
+              <w:t>remaining_qty</w:t>
+            </w:r>
+          </w:p>
+        </w:tc>
+        <w:tc>
+          <w:tcPr>
+            <w:tcW w:w="2736" w:type="dxa"/>
+            <w:tcBorders>
+              <w:top w:val="single" w:sz="2" w:space="0" w:color="CCCCCC"/>
+              <w:left w:val="single" w:sz="2" w:space="0" w:color="CCCCCC"/>
+              <w:bottom w:val="single" w:sz="2" w:space="0" w:color="CCCCCC"/>
+              <w:right w:val="single" w:sz="2" w:space="0" w:color="CCCCCC"/>
+            </w:tcBorders>
+            <w:shd w:val="clear" w:color="auto" w:fill="FFFFFF"/>
+          </w:tcPr>
+          <w:p>
+            <w:pPr>
+              <w:spacing w:before="60" w:after="60"/>
+            </w:pPr>
+            <w:r>
+              <w:rPr>
+                <w:rFonts w:ascii="Courier New" w:hAnsi="Courier New"/>
+                <w:color w:val="3B6D11"/>
+                <w:sz w:val="16"/>
+              </w:rPr>
+              <w:t>float</w:t>
+            </w:r>
+          </w:p>
+        </w:tc>
+        <w:tc>
+          <w:tcPr>
+            <w:tcW w:w="3888" w:type="dxa"/>
+            <w:tcBorders>
+              <w:top w:val="single" w:sz="2" w:space="0" w:color="CCCCCC"/>
+              <w:left w:val="single" w:sz="2" w:space="0" w:color="CCCCCC"/>
+              <w:bottom w:val="single" w:sz="2" w:space="0" w:color="CCCCCC"/>
+              <w:right w:val="single" w:sz="2" w:space="0" w:color="CCCCCC"/>
+            </w:tcBorders>
+            <w:shd w:val="clear" w:color="auto" w:fill="FFFFFF"/>
+          </w:tcPr>
+          <w:p>
+            <w:pPr>
+              <w:spacing w:before="60" w:after="60"/>
+            </w:pPr>
+            <w:r>
+              <w:rPr>
+                <w:rFonts w:ascii="Arial" w:hAnsi="Arial"/>
+                <w:color w:val="555555"/>
+                <w:sz w:val="18"/>
+              </w:rPr>
+              <w:t>Unfilled quantity; initialised to quantity</w:t>
+            </w:r>
+          </w:p>
+        </w:tc>
+      </w:tr>
+      <w:tr>
+        <w:tc>
+          <w:tcPr>
+            <w:tcW w:w="2736" w:type="dxa"/>
+            <w:tcBorders>
+              <w:top w:val="single" w:sz="2" w:space="0" w:color="CCCCCC"/>
+              <w:left w:val="single" w:sz="2" w:space="0" w:color="CCCCCC"/>
+              <w:bottom w:val="single" w:sz="2" w:space="0" w:color="CCCCCC"/>
+              <w:right w:val="single" w:sz="2" w:space="0" w:color="CCCCCC"/>
+            </w:tcBorders>
+            <w:shd w:val="clear" w:color="auto" w:fill="E6F1FB"/>
+          </w:tcPr>
+          <w:p>
+            <w:pPr>
+              <w:spacing w:before="60" w:after="60"/>
+            </w:pPr>
+            <w:r>
+              <w:rPr>
+                <w:rFonts w:ascii="Courier New" w:hAnsi="Courier New"/>
+                <w:b/>
+                <w:color w:val="042C53"/>
+                <w:sz w:val="18"/>
+              </w:rPr>
+              <w:t>timestamp</w:t>
+            </w:r>
+          </w:p>
+        </w:tc>
+        <w:tc>
+          <w:tcPr>
+            <w:tcW w:w="2736" w:type="dxa"/>
+            <w:tcBorders>
+              <w:top w:val="single" w:sz="2" w:space="0" w:color="CCCCCC"/>
+              <w:left w:val="single" w:sz="2" w:space="0" w:color="CCCCCC"/>
+              <w:bottom w:val="single" w:sz="2" w:space="0" w:color="CCCCCC"/>
+              <w:right w:val="single" w:sz="2" w:space="0" w:color="CCCCCC"/>
+            </w:tcBorders>
+            <w:shd w:val="clear" w:color="auto" w:fill="FFFFFF"/>
+          </w:tcPr>
+          <w:p>
+            <w:pPr>
+              <w:spacing w:before="60" w:after="60"/>
+            </w:pPr>
+            <w:r>
+              <w:rPr>
+                <w:rFonts w:ascii="Courier New" w:hAnsi="Courier New"/>
+                <w:color w:val="3B6D11"/>
+                <w:sz w:val="16"/>
+              </w:rPr>
+              <w:t>datetime</w:t>
+            </w:r>
+          </w:p>
+        </w:tc>
+        <w:tc>
+          <w:tcPr>
+            <w:tcW w:w="3888" w:type="dxa"/>
+            <w:tcBorders>
+              <w:top w:val="single" w:sz="2" w:space="0" w:color="CCCCCC"/>
+              <w:left w:val="single" w:sz="2" w:space="0" w:color="CCCCCC"/>
+              <w:bottom w:val="single" w:sz="2" w:space="0" w:color="CCCCCC"/>
+              <w:right w:val="single" w:sz="2" w:space="0" w:color="CCCCCC"/>
+            </w:tcBorders>
+            <w:shd w:val="clear" w:color="auto" w:fill="FFFFFF"/>
+          </w:tcPr>
+          <w:p>
+            <w:pPr>
+              <w:spacing w:before="60" w:after="60"/>
+            </w:pPr>
+            <w:r>
+              <w:rPr>
+                <w:rFonts w:ascii="Arial" w:hAnsi="Arial"/>
+                <w:color w:val="555555"/>
+                <w:sz w:val="18"/>
+              </w:rPr>
+              <w:t>Event creation time</w:t>
+            </w:r>
+          </w:p>
+        </w:tc>
+      </w:tr>
+    </w:tbl>
+    <w:p>
+      <w:pPr>
+        <w:spacing w:after="40"/>
+      </w:pPr>
+    </w:p>
+    <w:p>
+      <w:pPr>
+        <w:spacing w:before="120" w:after="40"/>
+      </w:pPr>
+      <w:r>
+        <w:rPr>
+          <w:rFonts w:ascii="Arial" w:hAnsi="Arial"/>
+          <w:b/>
+          <w:color w:val="185FA5"/>
+          <w:sz w:val="18"/>
+        </w:rPr>
+        <w:t>Methods</w:t>
+      </w:r>
+    </w:p>
+    <w:tbl>
+      <w:tblPr>
+        <w:tblStyle w:val="TableGrid"/>
+        <w:tblW w:w="0" w:type="auto"/>
+        <w:tblLook w:val="04A0" w:firstRow="1" w:lastRow="0" w:firstColumn="1" w:lastColumn="0" w:noHBand="0" w:noVBand="1"/>
+      </w:tblPr>
+      <w:tblGrid>
+        <w:gridCol w:w="2736"/>
+        <w:gridCol w:w="2736"/>
+        <w:gridCol w:w="3888"/>
+      </w:tblGrid>
+      <w:tr>
+        <w:tc>
+          <w:tcPr>
+            <w:tcW w:w="2736" w:type="dxa"/>
+            <w:tcBorders>
+              <w:top w:val="single" w:sz="2" w:space="0" w:color="CCCCCC"/>
+              <w:left w:val="single" w:sz="2" w:space="0" w:color="CCCCCC"/>
+              <w:bottom w:val="single" w:sz="2" w:space="0" w:color="CCCCCC"/>
+              <w:right w:val="single" w:sz="2" w:space="0" w:color="CCCCCC"/>
+            </w:tcBorders>
+            <w:shd w:val="clear" w:color="auto" w:fill="FAEEDA"/>
+          </w:tcPr>
+          <w:p>
+            <w:pPr>
+              <w:spacing w:before="60" w:after="60"/>
+            </w:pPr>
+            <w:r>
+              <w:rPr>
+                <w:rFonts w:ascii="Courier New" w:hAnsi="Courier New"/>
+                <w:b/>
+                <w:color w:val="042C53"/>
+                <w:sz w:val="18"/>
+              </w:rPr>
+              <w:t>__init__</w:t>
+            </w:r>
+          </w:p>
+        </w:tc>
+        <w:tc>
+          <w:tcPr>
+            <w:tcW w:w="2736" w:type="dxa"/>
+            <w:tcBorders>
+              <w:top w:val="single" w:sz="2" w:space="0" w:color="CCCCCC"/>
+              <w:left w:val="single" w:sz="2" w:space="0" w:color="CCCCCC"/>
+              <w:bottom w:val="single" w:sz="2" w:space="0" w:color="CCCCCC"/>
+              <w:right w:val="single" w:sz="2" w:space="0" w:color="CCCCCC"/>
+            </w:tcBorders>
+            <w:shd w:val="clear" w:color="auto" w:fill="FFFFFF"/>
+          </w:tcPr>
+          <w:p>
+            <w:pPr>
+              <w:spacing w:before="60" w:after="60"/>
+            </w:pPr>
+            <w:r>
+              <w:rPr>
+                <w:rFonts w:ascii="Courier New" w:hAnsi="Courier New"/>
+                <w:color w:val="3B6D11"/>
+                <w:sz w:val="16"/>
+              </w:rPr>
+              <w:t>(event: Event) -&gt; None</w:t>
+            </w:r>
+          </w:p>
+        </w:tc>
+        <w:tc>
+          <w:tcPr>
+            <w:tcW w:w="3888" w:type="dxa"/>
+            <w:tcBorders>
+              <w:top w:val="single" w:sz="2" w:space="0" w:color="CCCCCC"/>
+              <w:left w:val="single" w:sz="2" w:space="0" w:color="CCCCCC"/>
+              <w:bottom w:val="single" w:sz="2" w:space="0" w:color="CCCCCC"/>
+              <w:right w:val="single" w:sz="2" w:space="0" w:color="CCCCCC"/>
+            </w:tcBorders>
+            <w:shd w:val="clear" w:color="auto" w:fill="FFFFFF"/>
+          </w:tcPr>
+          <w:p>
+            <w:pPr>
+              <w:spacing w:before="60" w:after="60"/>
+            </w:pPr>
+            <w:r>
+              <w:rPr>
+                <w:rFonts w:ascii="Arial" w:hAnsi="Arial"/>
+                <w:color w:val="555555"/>
+                <w:sz w:val="18"/>
+              </w:rPr>
+              <w:t>Copies order_id, side, price, quantity, remaining_qty, timestamp from event; sets remaining_qty = quantity</w:t>
+            </w:r>
+          </w:p>
+        </w:tc>
+      </w:tr>
+      <w:tr>
+        <w:tc>
+          <w:tcPr>
+            <w:tcW w:w="2736" w:type="dxa"/>
+            <w:tcBorders>
+              <w:top w:val="single" w:sz="2" w:space="0" w:color="CCCCCC"/>
+              <w:left w:val="single" w:sz="2" w:space="0" w:color="CCCCCC"/>
+              <w:bottom w:val="single" w:sz="2" w:space="0" w:color="CCCCCC"/>
+              <w:right w:val="single" w:sz="2" w:space="0" w:color="CCCCCC"/>
+            </w:tcBorders>
+            <w:shd w:val="clear" w:color="auto" w:fill="FAEEDA"/>
+          </w:tcPr>
+          <w:p>
+            <w:pPr>
+              <w:spacing w:before="60" w:after="60"/>
+            </w:pPr>
+            <w:r>
+              <w:rPr>
+                <w:rFonts w:ascii="Courier New" w:hAnsi="Courier New"/>
+                <w:b/>
+                <w:color w:val="042C53"/>
+                <w:sz w:val="18"/>
+              </w:rPr>
+              <w:t>__repr__</w:t>
+            </w:r>
+          </w:p>
+        </w:tc>
+        <w:tc>
+          <w:tcPr>
+            <w:tcW w:w="2736" w:type="dxa"/>
+            <w:tcBorders>
+              <w:top w:val="single" w:sz="2" w:space="0" w:color="CCCCCC"/>
+              <w:left w:val="single" w:sz="2" w:space="0" w:color="CCCCCC"/>
+              <w:bottom w:val="single" w:sz="2" w:space="0" w:color="CCCCCC"/>
+              <w:right w:val="single" w:sz="2" w:space="0" w:color="CCCCCC"/>
+            </w:tcBorders>
+            <w:shd w:val="clear" w:color="auto" w:fill="FFFFFF"/>
+          </w:tcPr>
+          <w:p>
+            <w:pPr>
+              <w:spacing w:before="60" w:after="60"/>
+            </w:pPr>
+            <w:r>
+              <w:rPr>
+                <w:rFonts w:ascii="Courier New" w:hAnsi="Courier New"/>
+                <w:color w:val="3B6D11"/>
+                <w:sz w:val="16"/>
+              </w:rPr>
+              <w:t>() -&gt; str</w:t>
+            </w:r>
+          </w:p>
+        </w:tc>
+        <w:tc>
+          <w:tcPr>
+            <w:tcW w:w="3888" w:type="dxa"/>
+            <w:tcBorders>
+              <w:top w:val="single" w:sz="2" w:space="0" w:color="CCCCCC"/>
+              <w:left w:val="single" w:sz="2" w:space="0" w:color="CCCCCC"/>
+              <w:bottom w:val="single" w:sz="2" w:space="0" w:color="CCCCCC"/>
+              <w:right w:val="single" w:sz="2" w:space="0" w:color="CCCCCC"/>
+            </w:tcBorders>
+            <w:shd w:val="clear" w:color="auto" w:fill="FFFFFF"/>
+          </w:tcPr>
+          <w:p>
+            <w:pPr>
+              <w:spacing w:before="60" w:after="60"/>
+            </w:pPr>
+            <w:r>
+              <w:rPr>
+                <w:rFonts w:ascii="Arial" w:hAnsi="Arial"/>
+                <w:color w:val="555555"/>
+                <w:sz w:val="18"/>
+              </w:rPr>
+              <w:t>Debug string</w:t>
+            </w:r>
+          </w:p>
+        </w:tc>
+      </w:tr>
+      <w:tr>
+        <w:tc>
+          <w:tcPr>
+            <w:tcW w:w="2736" w:type="dxa"/>
+            <w:tcBorders>
+              <w:top w:val="single" w:sz="2" w:space="0" w:color="CCCCCC"/>
+              <w:left w:val="single" w:sz="2" w:space="0" w:color="CCCCCC"/>
+              <w:bottom w:val="single" w:sz="2" w:space="0" w:color="CCCCCC"/>
+              <w:right w:val="single" w:sz="2" w:space="0" w:color="CCCCCC"/>
+            </w:tcBorders>
+            <w:shd w:val="clear" w:color="auto" w:fill="FAEEDA"/>
+          </w:tcPr>
+          <w:p>
+            <w:pPr>
+              <w:spacing w:before="60" w:after="60"/>
+            </w:pPr>
+            <w:r>
+              <w:rPr>
+                <w:rFonts w:ascii="Courier New" w:hAnsi="Courier New"/>
+                <w:b/>
+                <w:color w:val="042C53"/>
+                <w:sz w:val="18"/>
+              </w:rPr>
+              <w:t>to_dict</w:t>
+            </w:r>
+          </w:p>
+        </w:tc>
+        <w:tc>
+          <w:tcPr>
+            <w:tcW w:w="2736" w:type="dxa"/>
+            <w:tcBorders>
+              <w:top w:val="single" w:sz="2" w:space="0" w:color="CCCCCC"/>
+              <w:left w:val="single" w:sz="2" w:space="0" w:color="CCCCCC"/>
+              <w:bottom w:val="single" w:sz="2" w:space="0" w:color="CCCCCC"/>
+              <w:right w:val="single" w:sz="2" w:space="0" w:color="CCCCCC"/>
+            </w:tcBorders>
+            <w:shd w:val="clear" w:color="auto" w:fill="FFFFFF"/>
+          </w:tcPr>
+          <w:p>
+            <w:pPr>
+              <w:spacing w:before="60" w:after="60"/>
+            </w:pPr>
+            <w:r>
+              <w:rPr>
+                <w:rFonts w:ascii="Courier New" w:hAnsi="Courier New"/>
+                <w:color w:val="3B6D11"/>
+                <w:sz w:val="16"/>
+              </w:rPr>
+              <w:t>() -&gt; dict</w:t>
+            </w:r>
+          </w:p>
+        </w:tc>
+        <w:tc>
+          <w:tcPr>
+            <w:tcW w:w="3888" w:type="dxa"/>
+            <w:tcBorders>
+              <w:top w:val="single" w:sz="2" w:space="0" w:color="CCCCCC"/>
+              <w:left w:val="single" w:sz="2" w:space="0" w:color="CCCCCC"/>
+              <w:bottom w:val="single" w:sz="2" w:space="0" w:color="CCCCCC"/>
+              <w:right w:val="single" w:sz="2" w:space="0" w:color="CCCCCC"/>
+            </w:tcBorders>
+            <w:shd w:val="clear" w:color="auto" w:fill="FFFFFF"/>
+          </w:tcPr>
+          <w:p>
+            <w:pPr>
+              <w:spacing w:before="60" w:after="60"/>
+            </w:pPr>
+            <w:r>
+              <w:rPr>
+                <w:rFonts w:ascii="Arial" w:hAnsi="Arial"/>
+                <w:color w:val="555555"/>
+                <w:sz w:val="18"/>
+              </w:rPr>
+              <w:t>Serialisable dict</w:t>
+            </w:r>
+          </w:p>
+        </w:tc>
+      </w:tr>
+      <w:tr>
+        <w:tc>
+          <w:tcPr>
+            <w:tcW w:w="2736" w:type="dxa"/>
+            <w:tcBorders>
+              <w:top w:val="single" w:sz="2" w:space="0" w:color="CCCCCC"/>
+              <w:left w:val="single" w:sz="2" w:space="0" w:color="CCCCCC"/>
+              <w:bottom w:val="single" w:sz="2" w:space="0" w:color="CCCCCC"/>
+              <w:right w:val="single" w:sz="2" w:space="0" w:color="CCCCCC"/>
+            </w:tcBorders>
+            <w:shd w:val="clear" w:color="auto" w:fill="FAEEDA"/>
+          </w:tcPr>
+          <w:p>
+            <w:pPr>
+              <w:spacing w:before="60" w:after="60"/>
+            </w:pPr>
+            <w:r>
+              <w:rPr>
+                <w:rFonts w:ascii="Courier New" w:hAnsi="Courier New"/>
+                <w:b/>
+                <w:color w:val="042C53"/>
+                <w:sz w:val="18"/>
+              </w:rPr>
+              <w:t>fill</w:t>
+            </w:r>
+          </w:p>
+        </w:tc>
+        <w:tc>
+          <w:tcPr>
+            <w:tcW w:w="2736" w:type="dxa"/>
+            <w:tcBorders>
+              <w:top w:val="single" w:sz="2" w:space="0" w:color="CCCCCC"/>
+              <w:left w:val="single" w:sz="2" w:space="0" w:color="CCCCCC"/>
+              <w:bottom w:val="single" w:sz="2" w:space="0" w:color="CCCCCC"/>
+              <w:right w:val="single" w:sz="2" w:space="0" w:color="CCCCCC"/>
+            </w:tcBorders>
+            <w:shd w:val="clear" w:color="auto" w:fill="FFFFFF"/>
+          </w:tcPr>
+          <w:p>
+            <w:pPr>
+              <w:spacing w:before="60" w:after="60"/>
+            </w:pPr>
+            <w:r>
+              <w:rPr>
+                <w:rFonts w:ascii="Courier New" w:hAnsi="Courier New"/>
+                <w:color w:val="3B6D11"/>
+                <w:sz w:val="16"/>
+              </w:rPr>
+              <w:t>(qty: float) -&gt; float</w:t>
+            </w:r>
+          </w:p>
+        </w:tc>
+        <w:tc>
+          <w:tcPr>
+            <w:tcW w:w="3888" w:type="dxa"/>
+            <w:tcBorders>
+              <w:top w:val="single" w:sz="2" w:space="0" w:color="CCCCCC"/>
+              <w:left w:val="single" w:sz="2" w:space="0" w:color="CCCCCC"/>
+              <w:bottom w:val="single" w:sz="2" w:space="0" w:color="CCCCCC"/>
+              <w:right w:val="single" w:sz="2" w:space="0" w:color="CCCCCC"/>
+            </w:tcBorders>
+            <w:shd w:val="clear" w:color="auto" w:fill="FFFFFF"/>
+          </w:tcPr>
+          <w:p>
+            <w:pPr>
+              <w:spacing w:before="60" w:after="60"/>
+            </w:pPr>
+            <w:r>
+              <w:rPr>
+                <w:rFonts w:ascii="Arial" w:hAnsi="Arial"/>
+                <w:color w:val="555555"/>
+                <w:sz w:val="18"/>
+              </w:rPr>
+              <w:t>Reduces remaining_qty by qty; returns filled amount; raises ValueError if qty out of range</w:t>
+            </w:r>
+          </w:p>
+        </w:tc>
+      </w:tr>
+      <w:tr>
+        <w:tc>
+          <w:tcPr>
+            <w:tcW w:w="2736" w:type="dxa"/>
+            <w:tcBorders>
+              <w:top w:val="single" w:sz="2" w:space="0" w:color="CCCCCC"/>
+              <w:left w:val="single" w:sz="2" w:space="0" w:color="CCCCCC"/>
+              <w:bottom w:val="single" w:sz="2" w:space="0" w:color="CCCCCC"/>
+              <w:right w:val="single" w:sz="2" w:space="0" w:color="CCCCCC"/>
+            </w:tcBorders>
+            <w:shd w:val="clear" w:color="auto" w:fill="FAEEDA"/>
+          </w:tcPr>
+          <w:p>
+            <w:pPr>
+              <w:spacing w:before="60" w:after="60"/>
+            </w:pPr>
+            <w:r>
+              <w:rPr>
+                <w:rFonts w:ascii="Courier New" w:hAnsi="Courier New"/>
+                <w:b/>
+                <w:color w:val="042C53"/>
+                <w:sz w:val="18"/>
+              </w:rPr>
+              <w:t>is_complete</w:t>
+            </w:r>
+          </w:p>
+        </w:tc>
+        <w:tc>
+          <w:tcPr>
+            <w:tcW w:w="2736" w:type="dxa"/>
+            <w:tcBorders>
+              <w:top w:val="single" w:sz="2" w:space="0" w:color="CCCCCC"/>
+              <w:left w:val="single" w:sz="2" w:space="0" w:color="CCCCCC"/>
+              <w:bottom w:val="single" w:sz="2" w:space="0" w:color="CCCCCC"/>
+              <w:right w:val="single" w:sz="2" w:space="0" w:color="CCCCCC"/>
+            </w:tcBorders>
+            <w:shd w:val="clear" w:color="auto" w:fill="FFFFFF"/>
+          </w:tcPr>
+          <w:p>
+            <w:pPr>
+              <w:spacing w:before="60" w:after="60"/>
+            </w:pPr>
+            <w:r>
+              <w:rPr>
+                <w:rFonts w:ascii="Courier New" w:hAnsi="Courier New"/>
+                <w:color w:val="3B6D11"/>
+                <w:sz w:val="16"/>
+              </w:rPr>
+              <w:t>() -&gt; bool</w:t>
+            </w:r>
+          </w:p>
+        </w:tc>
+        <w:tc>
+          <w:tcPr>
+            <w:tcW w:w="3888" w:type="dxa"/>
+            <w:tcBorders>
+              <w:top w:val="single" w:sz="2" w:space="0" w:color="CCCCCC"/>
+              <w:left w:val="single" w:sz="2" w:space="0" w:color="CCCCCC"/>
+              <w:bottom w:val="single" w:sz="2" w:space="0" w:color="CCCCCC"/>
+              <w:right w:val="single" w:sz="2" w:space="0" w:color="CCCCCC"/>
+            </w:tcBorders>
+            <w:shd w:val="clear" w:color="auto" w:fill="FFFFFF"/>
+          </w:tcPr>
+          <w:p>
+            <w:pPr>
+              <w:spacing w:before="60" w:after="60"/>
+            </w:pPr>
+            <w:r>
+              <w:rPr>
+                <w:rFonts w:ascii="Arial" w:hAnsi="Arial"/>
+                <w:color w:val="555555"/>
+                <w:sz w:val="18"/>
+              </w:rPr>
+              <w:t>True when remaining_qty == 0</w:t>
+            </w:r>
+          </w:p>
+        </w:tc>
+      </w:tr>
+    </w:tbl>
+    <w:p>
+      <w:pPr>
+        <w:spacing w:after="40"/>
+      </w:pPr>
+    </w:p>
+    <w:p>
+      <w:pPr>
+        <w:spacing w:after="160"/>
+      </w:pPr>
+    </w:p>
+    <w:tbl>
+      <w:tblPr>
+        <w:tblStyle w:val="TableGrid"/>
+        <w:tblW w:w="0" w:type="auto"/>
+        <w:tblLook w:val="04A0" w:firstRow="1" w:lastRow="0" w:firstColumn="1" w:lastColumn="0" w:noHBand="0" w:noVBand="1"/>
+      </w:tblPr>
+      <w:tblGrid>
+        <w:gridCol w:w="9360"/>
+      </w:tblGrid>
+      <w:tr>
+        <w:tc>
+          <w:tcPr>
+            <w:tcW w:w="9360" w:type="dxa"/>
+            <w:tcBorders>
+              <w:top w:val="single" w:sz="6" w:space="0" w:color="378ADD"/>
+              <w:left w:val="single" w:sz="6" w:space="0" w:color="378ADD"/>
+              <w:bottom w:val="single" w:sz="6" w:space="0" w:color="378ADD"/>
+              <w:right w:val="single" w:sz="6" w:space="0" w:color="378ADD"/>
+            </w:tcBorders>
+            <w:shd w:val="clear" w:color="auto" w:fill="E6F1FB"/>
+          </w:tcPr>
+          <w:p>
+            <w:pPr>
+              <w:spacing w:before="80" w:after="80"/>
+            </w:pPr>
+            <w:r>
+              <w:rPr>
+                <w:rFonts w:ascii="Courier New" w:hAnsi="Courier New"/>
+                <w:b/>
+                <w:color w:val="042C53"/>
+              </w:rPr>
+              <w:t>class  IncomingOrder</w:t>
+            </w:r>
+            <w:r>
+              <w:rPr>
+                <w:rFonts w:ascii="Arial" w:hAnsi="Arial"/>
+                <w:i/>
+                <w:color w:val="185FA5"/>
+                <w:sz w:val="20"/>
+              </w:rPr>
+              <w:t xml:space="preserve">    — mutable order used only during matching; extends BaseOrder</w:t>
+            </w:r>
+          </w:p>
+        </w:tc>
+      </w:tr>
+    </w:tbl>
+    <w:p>
+      <w:pPr>
+        <w:spacing w:after="60"/>
+      </w:pPr>
+    </w:p>
+    <w:p>
+      <w:pPr>
+        <w:spacing w:before="120" w:after="40"/>
+      </w:pPr>
+      <w:r>
+        <w:rPr>
+          <w:rFonts w:ascii="Arial" w:hAnsi="Arial"/>
+          <w:b/>
+          <w:color w:val="185FA5"/>
+          <w:sz w:val="18"/>
+        </w:rPr>
+        <w:t>Extra Attribute</w:t>
+      </w:r>
+    </w:p>
+    <w:tbl>
+      <w:tblPr>
+        <w:tblStyle w:val="TableGrid"/>
+        <w:tblW w:w="0" w:type="auto"/>
+        <w:tblLook w:val="04A0" w:firstRow="1" w:lastRow="0" w:firstColumn="1" w:lastColumn="0" w:noHBand="0" w:noVBand="1"/>
+      </w:tblPr>
+      <w:tblGrid>
+        <w:gridCol w:w="2736"/>
+        <w:gridCol w:w="2736"/>
+        <w:gridCol w:w="3888"/>
+      </w:tblGrid>
+      <w:tr>
+        <w:tc>
+          <w:tcPr>
+            <w:tcW w:w="2736" w:type="dxa"/>
+            <w:tcBorders>
+              <w:top w:val="single" w:sz="2" w:space="0" w:color="CCCCCC"/>
+              <w:left w:val="single" w:sz="2" w:space="0" w:color="CCCCCC"/>
+              <w:bottom w:val="single" w:sz="2" w:space="0" w:color="CCCCCC"/>
+              <w:right w:val="single" w:sz="2" w:space="0" w:color="CCCCCC"/>
+            </w:tcBorders>
+            <w:shd w:val="clear" w:color="auto" w:fill="E6F1FB"/>
+          </w:tcPr>
+          <w:p>
+            <w:pPr>
+              <w:spacing w:before="60" w:after="60"/>
+            </w:pPr>
+            <w:r>
+              <w:rPr>
+                <w:rFonts w:ascii="Courier New" w:hAnsi="Courier New"/>
+                <w:b/>
+                <w:color w:val="042C53"/>
+                <w:sz w:val="18"/>
+              </w:rPr>
+              <w:t>order_type</w:t>
+            </w:r>
+          </w:p>
+        </w:tc>
+        <w:tc>
+          <w:tcPr>
+            <w:tcW w:w="2736" w:type="dxa"/>
+            <w:tcBorders>
+              <w:top w:val="single" w:sz="2" w:space="0" w:color="CCCCCC"/>
+              <w:left w:val="single" w:sz="2" w:space="0" w:color="CCCCCC"/>
+              <w:bottom w:val="single" w:sz="2" w:space="0" w:color="CCCCCC"/>
+              <w:right w:val="single" w:sz="2" w:space="0" w:color="CCCCCC"/>
+            </w:tcBorders>
+            <w:shd w:val="clear" w:color="auto" w:fill="FFFFFF"/>
+          </w:tcPr>
+          <w:p>
+            <w:pPr>
+              <w:spacing w:before="60" w:after="60"/>
+            </w:pPr>
+            <w:r>
+              <w:rPr>
+                <w:rFonts w:ascii="Courier New" w:hAnsi="Courier New"/>
+                <w:color w:val="3B6D11"/>
+                <w:sz w:val="16"/>
+              </w:rPr>
+              <w:t>str</w:t>
+            </w:r>
+          </w:p>
+        </w:tc>
+        <w:tc>
+          <w:tcPr>
+            <w:tcW w:w="3888" w:type="dxa"/>
+            <w:tcBorders>
+              <w:top w:val="single" w:sz="2" w:space="0" w:color="CCCCCC"/>
+              <w:left w:val="single" w:sz="2" w:space="0" w:color="CCCCCC"/>
+              <w:bottom w:val="single" w:sz="2" w:space="0" w:color="CCCCCC"/>
+              <w:right w:val="single" w:sz="2" w:space="0" w:color="CCCCCC"/>
+            </w:tcBorders>
+            <w:shd w:val="clear" w:color="auto" w:fill="FFFFFF"/>
+          </w:tcPr>
+          <w:p>
+            <w:pPr>
+              <w:spacing w:before="60" w:after="60"/>
+            </w:pPr>
+            <w:r>
+              <w:rPr>
+                <w:rFonts w:ascii="Arial" w:hAnsi="Arial"/>
+                <w:color w:val="555555"/>
+                <w:sz w:val="18"/>
+              </w:rPr>
+              <w:t>'limit' or 'market'; all BaseOrder fields also inherited</w:t>
+            </w:r>
+          </w:p>
+        </w:tc>
+      </w:tr>
+    </w:tbl>
+    <w:p>
+      <w:pPr>
+        <w:spacing w:after="40"/>
+      </w:pPr>
+    </w:p>
+    <w:p>
+      <w:pPr>
+        <w:spacing w:before="120" w:after="40"/>
+      </w:pPr>
+      <w:r>
+        <w:rPr>
+          <w:rFonts w:ascii="Arial" w:hAnsi="Arial"/>
+          <w:b/>
+          <w:color w:val="185FA5"/>
+          <w:sz w:val="18"/>
+        </w:rPr>
+        <w:t>Methods</w:t>
+      </w:r>
+    </w:p>
+    <w:tbl>
+      <w:tblPr>
+        <w:tblStyle w:val="TableGrid"/>
+        <w:tblW w:w="0" w:type="auto"/>
+        <w:tblLook w:val="04A0" w:firstRow="1" w:lastRow="0" w:firstColumn="1" w:lastColumn="0" w:noHBand="0" w:noVBand="1"/>
+      </w:tblPr>
+      <w:tblGrid>
+        <w:gridCol w:w="2736"/>
+        <w:gridCol w:w="2736"/>
+        <w:gridCol w:w="3888"/>
+      </w:tblGrid>
+      <w:tr>
+        <w:tc>
+          <w:tcPr>
+            <w:tcW w:w="2736" w:type="dxa"/>
+            <w:tcBorders>
+              <w:top w:val="single" w:sz="2" w:space="0" w:color="CCCCCC"/>
+              <w:left w:val="single" w:sz="2" w:space="0" w:color="CCCCCC"/>
+              <w:bottom w:val="single" w:sz="2" w:space="0" w:color="CCCCCC"/>
+              <w:right w:val="single" w:sz="2" w:space="0" w:color="CCCCCC"/>
+            </w:tcBorders>
+            <w:shd w:val="clear" w:color="auto" w:fill="FAEEDA"/>
+          </w:tcPr>
+          <w:p>
+            <w:pPr>
+              <w:spacing w:before="60" w:after="60"/>
+            </w:pPr>
+            <w:r>
+              <w:rPr>
+                <w:rFonts w:ascii="Courier New" w:hAnsi="Courier New"/>
+                <w:b/>
+                <w:color w:val="042C53"/>
+                <w:sz w:val="18"/>
+              </w:rPr>
+              <w:t>__init__</w:t>
+            </w:r>
+          </w:p>
+        </w:tc>
+        <w:tc>
+          <w:tcPr>
+            <w:tcW w:w="2736" w:type="dxa"/>
+            <w:tcBorders>
+              <w:top w:val="single" w:sz="2" w:space="0" w:color="CCCCCC"/>
+              <w:left w:val="single" w:sz="2" w:space="0" w:color="CCCCCC"/>
+              <w:bottom w:val="single" w:sz="2" w:space="0" w:color="CCCCCC"/>
+              <w:right w:val="single" w:sz="2" w:space="0" w:color="CCCCCC"/>
+            </w:tcBorders>
+            <w:shd w:val="clear" w:color="auto" w:fill="FFFFFF"/>
+          </w:tcPr>
+          <w:p>
+            <w:pPr>
+              <w:spacing w:before="60" w:after="60"/>
+            </w:pPr>
+            <w:r>
+              <w:rPr>
+                <w:rFonts w:ascii="Courier New" w:hAnsi="Courier New"/>
+                <w:color w:val="3B6D11"/>
+                <w:sz w:val="16"/>
+              </w:rPr>
+              <w:t>(event: Event) -&gt; None</w:t>
+            </w:r>
+          </w:p>
+        </w:tc>
+        <w:tc>
+          <w:tcPr>
+            <w:tcW w:w="3888" w:type="dxa"/>
+            <w:tcBorders>
+              <w:top w:val="single" w:sz="2" w:space="0" w:color="CCCCCC"/>
+              <w:left w:val="single" w:sz="2" w:space="0" w:color="CCCCCC"/>
+              <w:bottom w:val="single" w:sz="2" w:space="0" w:color="CCCCCC"/>
+              <w:right w:val="single" w:sz="2" w:space="0" w:color="CCCCCC"/>
+            </w:tcBorders>
+            <w:shd w:val="clear" w:color="auto" w:fill="FFFFFF"/>
+          </w:tcPr>
+          <w:p>
+            <w:pPr>
+              <w:spacing w:before="60" w:after="60"/>
+            </w:pPr>
+            <w:r>
+              <w:rPr>
+                <w:rFonts w:ascii="Arial" w:hAnsi="Arial"/>
+                <w:color w:val="555555"/>
+                <w:sz w:val="18"/>
+              </w:rPr>
+              <w:t>Calls super(); copies order_type from event; precondition: order_type in {limit, market}</w:t>
+            </w:r>
+          </w:p>
+        </w:tc>
+      </w:tr>
+      <w:tr>
+        <w:tc>
+          <w:tcPr>
+            <w:tcW w:w="2736" w:type="dxa"/>
+            <w:tcBorders>
+              <w:top w:val="single" w:sz="2" w:space="0" w:color="CCCCCC"/>
+              <w:left w:val="single" w:sz="2" w:space="0" w:color="CCCCCC"/>
+              <w:bottom w:val="single" w:sz="2" w:space="0" w:color="CCCCCC"/>
+              <w:right w:val="single" w:sz="2" w:space="0" w:color="CCCCCC"/>
+            </w:tcBorders>
+            <w:shd w:val="clear" w:color="auto" w:fill="FAEEDA"/>
+          </w:tcPr>
+          <w:p>
+            <w:pPr>
+              <w:spacing w:before="60" w:after="60"/>
+            </w:pPr>
+            <w:r>
+              <w:rPr>
+                <w:rFonts w:ascii="Courier New" w:hAnsi="Courier New"/>
+                <w:b/>
+                <w:color w:val="042C53"/>
+                <w:sz w:val="18"/>
+              </w:rPr>
+              <w:t>__repr__</w:t>
+            </w:r>
+          </w:p>
+        </w:tc>
+        <w:tc>
+          <w:tcPr>
+            <w:tcW w:w="2736" w:type="dxa"/>
+            <w:tcBorders>
+              <w:top w:val="single" w:sz="2" w:space="0" w:color="CCCCCC"/>
+              <w:left w:val="single" w:sz="2" w:space="0" w:color="CCCCCC"/>
+              <w:bottom w:val="single" w:sz="2" w:space="0" w:color="CCCCCC"/>
+              <w:right w:val="single" w:sz="2" w:space="0" w:color="CCCCCC"/>
+            </w:tcBorders>
+            <w:shd w:val="clear" w:color="auto" w:fill="FFFFFF"/>
+          </w:tcPr>
+          <w:p>
+            <w:pPr>
+              <w:spacing w:before="60" w:after="60"/>
+            </w:pPr>
+            <w:r>
+              <w:rPr>
+                <w:rFonts w:ascii="Courier New" w:hAnsi="Courier New"/>
+                <w:color w:val="3B6D11"/>
+                <w:sz w:val="16"/>
+              </w:rPr>
+              <w:t>() -&gt; str</w:t>
+            </w:r>
+          </w:p>
+        </w:tc>
+        <w:tc>
+          <w:tcPr>
+            <w:tcW w:w="3888" w:type="dxa"/>
+            <w:tcBorders>
+              <w:top w:val="single" w:sz="2" w:space="0" w:color="CCCCCC"/>
+              <w:left w:val="single" w:sz="2" w:space="0" w:color="CCCCCC"/>
+              <w:bottom w:val="single" w:sz="2" w:space="0" w:color="CCCCCC"/>
+              <w:right w:val="single" w:sz="2" w:space="0" w:color="CCCCCC"/>
+            </w:tcBorders>
+            <w:shd w:val="clear" w:color="auto" w:fill="FFFFFF"/>
+          </w:tcPr>
+          <w:p>
+            <w:pPr>
+              <w:spacing w:before="60" w:after="60"/>
+            </w:pPr>
+            <w:r>
+              <w:rPr>
+                <w:rFonts w:ascii="Arial" w:hAnsi="Arial"/>
+                <w:color w:val="555555"/>
+                <w:sz w:val="18"/>
+              </w:rPr>
+              <w:t>Debug string</w:t>
+            </w:r>
+          </w:p>
+        </w:tc>
+      </w:tr>
+      <w:tr>
+        <w:tc>
+          <w:tcPr>
+            <w:tcW w:w="2736" w:type="dxa"/>
+            <w:tcBorders>
+              <w:top w:val="single" w:sz="2" w:space="0" w:color="CCCCCC"/>
+              <w:left w:val="single" w:sz="2" w:space="0" w:color="CCCCCC"/>
+              <w:bottom w:val="single" w:sz="2" w:space="0" w:color="CCCCCC"/>
+              <w:right w:val="single" w:sz="2" w:space="0" w:color="CCCCCC"/>
+            </w:tcBorders>
+            <w:shd w:val="clear" w:color="auto" w:fill="FAEEDA"/>
+          </w:tcPr>
+          <w:p>
+            <w:pPr>
+              <w:spacing w:before="60" w:after="60"/>
+            </w:pPr>
+            <w:r>
+              <w:rPr>
+                <w:rFonts w:ascii="Courier New" w:hAnsi="Courier New"/>
+                <w:b/>
+                <w:color w:val="042C53"/>
+                <w:sz w:val="18"/>
+              </w:rPr>
+              <w:t>to_dict</w:t>
+            </w:r>
+          </w:p>
+        </w:tc>
+        <w:tc>
+          <w:tcPr>
+            <w:tcW w:w="2736" w:type="dxa"/>
+            <w:tcBorders>
+              <w:top w:val="single" w:sz="2" w:space="0" w:color="CCCCCC"/>
+              <w:left w:val="single" w:sz="2" w:space="0" w:color="CCCCCC"/>
+              <w:bottom w:val="single" w:sz="2" w:space="0" w:color="CCCCCC"/>
+              <w:right w:val="single" w:sz="2" w:space="0" w:color="CCCCCC"/>
+            </w:tcBorders>
+            <w:shd w:val="clear" w:color="auto" w:fill="FFFFFF"/>
+          </w:tcPr>
+          <w:p>
+            <w:pPr>
+              <w:spacing w:before="60" w:after="60"/>
+            </w:pPr>
+            <w:r>
+              <w:rPr>
+                <w:rFonts w:ascii="Courier New" w:hAnsi="Courier New"/>
+                <w:color w:val="3B6D11"/>
+                <w:sz w:val="16"/>
+              </w:rPr>
+              <w:t>() -&gt; dict</w:t>
+            </w:r>
+          </w:p>
+        </w:tc>
+        <w:tc>
+          <w:tcPr>
+            <w:tcW w:w="3888" w:type="dxa"/>
+            <w:tcBorders>
+              <w:top w:val="single" w:sz="2" w:space="0" w:color="CCCCCC"/>
+              <w:left w:val="single" w:sz="2" w:space="0" w:color="CCCCCC"/>
+              <w:bottom w:val="single" w:sz="2" w:space="0" w:color="CCCCCC"/>
+              <w:right w:val="single" w:sz="2" w:space="0" w:color="CCCCCC"/>
+            </w:tcBorders>
+            <w:shd w:val="clear" w:color="auto" w:fill="FFFFFF"/>
+          </w:tcPr>
+          <w:p>
+            <w:pPr>
+              <w:spacing w:before="60" w:after="60"/>
+            </w:pPr>
+            <w:r>
+              <w:rPr>
+                <w:rFonts w:ascii="Arial" w:hAnsi="Arial"/>
+                <w:color w:val="555555"/>
+                <w:sz w:val="18"/>
+              </w:rPr>
+              <w:t>Adds order_type to BaseOrder.to_dict()</w:t>
             </w:r>
           </w:p>
         </w:tc>
@@ -6822,7 +8228,7 @@
                 <w:color w:val="3B6D11"/>
                 <w:sz w:val="16"/>
               </w:rPr>
-              <w:t>(incoming: Order, level: PriceLevel) -&gt; list[dict]</w:t>
+              <w:t>(incoming: IncomingOrder, level: PriceLevel) -&gt; list[dict]</w:t>
             </w:r>
           </w:p>
         </w:tc>
@@ -6900,7 +8306,7 @@
                 <w:color w:val="3B6D11"/>
                 <w:sz w:val="16"/>
               </w:rPr>
-              <w:t>(maker: Order, taker: Order, qty: float, price: float) -&gt; dict</w:t>
+              <w:t>@staticmethod  (maker: Order, taker: IncomingOrder, quantity: float, price: float) -&gt; dict</w:t>
             </w:r>
           </w:p>
         </w:tc>
@@ -6978,7 +8384,7 @@
                 <w:color w:val="3B6D11"/>
                 <w:sz w:val="16"/>
               </w:rPr>
-              <w:t>(expected_price: float, fills: list[dict]) -&gt; float</w:t>
+              <w:t>@staticmethod  (expected_price: float, fills: list[dict]) -&gt; float</w:t>
             </w:r>
           </w:p>
         </w:tc>
@@ -7159,7 +8565,7 @@
                 <w:color w:val="555555"/>
                 <w:sz w:val="18"/>
               </w:rPr>
-              <w:t>Returns fill_rate, avg_slippage, avg_execution_cost, queue_wait_time from execution_log</w:t>
+              <w:t>Returns copy of metrics dict augmented with average_slippage = total_slippage / fill_count</w:t>
             </w:r>
           </w:p>
         </w:tc>
@@ -7201,7 +8607,7 @@
           <w:color w:val="555555"/>
           <w:sz w:val="20"/>
         </w:rPr>
-        <w:t>Reads historical or synthetic event sequences from CSV and converts them into Event objects.  Also generates synthetic scenarios for simulation experiments (low liquidity, high volatility, balanced flow).</w:t>
+        <w:t>Reads internal Quantyze CSVs or raw LOBSTER message files and converts them into Event objects. Auto-detects format. Also generates synthetic scenarios and builds model-ready feature/label arrays from event data.</w:t>
       </w:r>
     </w:p>
     <w:p>
@@ -7225,7 +8631,7 @@
           <w:color w:val="555555"/>
           <w:sz w:val="20"/>
         </w:rPr>
-        <w:t xml:space="preserve">  —  DataLoader — CSV I/O and synthetic event generation</w:t>
+        <w:t xml:space="preserve">  —  DataLoader — CSV I/O (internal + LOBSTER), synthetic generation, and feature/label building</w:t>
       </w:r>
     </w:p>
     <w:tbl>
@@ -7508,7 +8914,7 @@
                 <w:color w:val="3B6D11"/>
                 <w:sz w:val="16"/>
               </w:rPr>
-              <w:t>dict</w:t>
+              <w:t>list[str]</w:t>
             </w:r>
           </w:p>
         </w:tc>
@@ -7533,7 +8939,319 @@
                 <w:color w:val="555555"/>
                 <w:sz w:val="18"/>
               </w:rPr>
-              <w:t>Expected column names and types for validation</w:t>
+              <w:t>Column names from the loaded CSV header</w:t>
+            </w:r>
+          </w:p>
+        </w:tc>
+      </w:tr>
+      <w:tr w14:paraId="DL000010">
+        <w:tc>
+          <w:tcPr>
+            <w:tcW w:w="2736" w:type="dxa"/>
+            <w:tcBorders>
+              <w:top w:val="single" w:sz="2" w:space="0" w:color="CCCCCC"/>
+              <w:left w:val="single" w:sz="2" w:space="0" w:color="CCCCCC"/>
+              <w:bottom w:val="single" w:sz="2" w:space="0" w:color="CCCCCC"/>
+              <w:right w:val="single" w:sz="2" w:space="0" w:color="CCCCCC"/>
+            </w:tcBorders>
+            <w:shd w:val="clear" w:color="auto" w:fill="E6F1FB"/>
+          </w:tcPr>
+          <w:p w14:paraId="DL000011">
+            <w:pPr>
+              <w:spacing w:before="60" w:after="60"/>
+            </w:pPr>
+            <w:r>
+              <w:rPr>
+                <w:rFonts w:ascii="Courier New" w:hAnsi="Courier New"/>
+                <w:b/>
+                <w:color w:val="042C53"/>
+                <w:sz w:val="18"/>
+              </w:rPr>
+              <w:t>source_format</w:t>
+            </w:r>
+          </w:p>
+        </w:tc>
+        <w:tc>
+          <w:tcPr>
+            <w:tcW w:w="2736" w:type="dxa"/>
+            <w:tcBorders>
+              <w:top w:val="single" w:sz="2" w:space="0" w:color="CCCCCC"/>
+              <w:left w:val="single" w:sz="2" w:space="0" w:color="CCCCCC"/>
+              <w:bottom w:val="single" w:sz="2" w:space="0" w:color="CCCCCC"/>
+              <w:right w:val="single" w:sz="2" w:space="0" w:color="CCCCCC"/>
+            </w:tcBorders>
+            <w:shd w:val="clear" w:color="auto" w:fill="FFFFFF"/>
+          </w:tcPr>
+          <w:p w14:paraId="DL000012">
+            <w:pPr>
+              <w:spacing w:before="60" w:after="60"/>
+            </w:pPr>
+            <w:r>
+              <w:rPr>
+                <w:rFonts w:ascii="Courier New" w:hAnsi="Courier New"/>
+                <w:color w:val="3B6D11"/>
+                <w:sz w:val="16"/>
+              </w:rPr>
+              <w:t>str | None</w:t>
+            </w:r>
+          </w:p>
+        </w:tc>
+        <w:tc>
+          <w:tcPr>
+            <w:tcW w:w="3888" w:type="dxa"/>
+            <w:tcBorders>
+              <w:top w:val="single" w:sz="2" w:space="0" w:color="CCCCCC"/>
+              <w:left w:val="single" w:sz="2" w:space="0" w:color="CCCCCC"/>
+              <w:bottom w:val="single" w:sz="2" w:space="0" w:color="CCCCCC"/>
+              <w:right w:val="single" w:sz="2" w:space="0" w:color="CCCCCC"/>
+            </w:tcBorders>
+            <w:shd w:val="clear" w:color="auto" w:fill="FFFFFF"/>
+          </w:tcPr>
+          <w:p w14:paraId="DL000013">
+            <w:pPr>
+              <w:spacing w:before="60" w:after="60"/>
+            </w:pPr>
+            <w:r>
+              <w:rPr>
+                <w:rFonts w:ascii="Arial" w:hAnsi="Arial"/>
+                <w:color w:val="555555"/>
+                <w:sz w:val="18"/>
+              </w:rPr>
+              <w:t>'internal', 'lobster', or 'synthetic'; None if unset</w:t>
+            </w:r>
+          </w:p>
+        </w:tc>
+      </w:tr>
+      <w:tr w14:paraId="DL000020">
+        <w:tc>
+          <w:tcPr>
+            <w:tcW w:w="2736" w:type="dxa"/>
+            <w:tcBorders>
+              <w:top w:val="single" w:sz="2" w:space="0" w:color="CCCCCC"/>
+              <w:left w:val="single" w:sz="2" w:space="0" w:color="CCCCCC"/>
+              <w:bottom w:val="single" w:sz="2" w:space="0" w:color="CCCCCC"/>
+              <w:right w:val="single" w:sz="2" w:space="0" w:color="CCCCCC"/>
+            </w:tcBorders>
+            <w:shd w:val="clear" w:color="auto" w:fill="E6F1FB"/>
+          </w:tcPr>
+          <w:p w14:paraId="DL000021">
+            <w:pPr>
+              <w:spacing w:before="60" w:after="60"/>
+            </w:pPr>
+            <w:r>
+              <w:rPr>
+                <w:rFonts w:ascii="Courier New" w:hAnsi="Courier New"/>
+                <w:b/>
+                <w:color w:val="042C53"/>
+                <w:sz w:val="18"/>
+              </w:rPr>
+              <w:t>raw_rows</w:t>
+            </w:r>
+          </w:p>
+        </w:tc>
+        <w:tc>
+          <w:tcPr>
+            <w:tcW w:w="2736" w:type="dxa"/>
+            <w:tcBorders>
+              <w:top w:val="single" w:sz="2" w:space="0" w:color="CCCCCC"/>
+              <w:left w:val="single" w:sz="2" w:space="0" w:color="CCCCCC"/>
+              <w:bottom w:val="single" w:sz="2" w:space="0" w:color="CCCCCC"/>
+              <w:right w:val="single" w:sz="2" w:space="0" w:color="CCCCCC"/>
+            </w:tcBorders>
+            <w:shd w:val="clear" w:color="auto" w:fill="FFFFFF"/>
+          </w:tcPr>
+          <w:p w14:paraId="DL000022">
+            <w:pPr>
+              <w:spacing w:before="60" w:after="60"/>
+            </w:pPr>
+            <w:r>
+              <w:rPr>
+                <w:rFonts w:ascii="Courier New" w:hAnsi="Courier New"/>
+                <w:color w:val="3B6D11"/>
+                <w:sz w:val="16"/>
+              </w:rPr>
+              <w:t>list[list[str]]</w:t>
+            </w:r>
+          </w:p>
+        </w:tc>
+        <w:tc>
+          <w:tcPr>
+            <w:tcW w:w="3888" w:type="dxa"/>
+            <w:tcBorders>
+              <w:top w:val="single" w:sz="2" w:space="0" w:color="CCCCCC"/>
+              <w:left w:val="single" w:sz="2" w:space="0" w:color="CCCCCC"/>
+              <w:bottom w:val="single" w:sz="2" w:space="0" w:color="CCCCCC"/>
+              <w:right w:val="single" w:sz="2" w:space="0" w:color="CCCCCC"/>
+            </w:tcBorders>
+            <w:shd w:val="clear" w:color="auto" w:fill="FFFFFF"/>
+          </w:tcPr>
+          <w:p w14:paraId="DL000023">
+            <w:pPr>
+              <w:spacing w:before="60" w:after="60"/>
+            </w:pPr>
+            <w:r>
+              <w:rPr>
+                <w:rFonts w:ascii="Arial" w:hAnsi="Arial"/>
+                <w:color w:val="555555"/>
+                <w:sz w:val="18"/>
+              </w:rPr>
+              <w:t>Raw LOBSTER message rows kept for training dataset building</w:t>
+            </w:r>
+          </w:p>
+        </w:tc>
+      </w:tr>
+      <w:tr w14:paraId="DL000030">
+        <w:tc>
+          <w:tcPr>
+            <w:tcW w:w="2736" w:type="dxa"/>
+            <w:tcBorders>
+              <w:top w:val="single" w:sz="2" w:space="0" w:color="CCCCCC"/>
+              <w:left w:val="single" w:sz="2" w:space="0" w:color="CCCCCC"/>
+              <w:bottom w:val="single" w:sz="2" w:space="0" w:color="CCCCCC"/>
+              <w:right w:val="single" w:sz="2" w:space="0" w:color="CCCCCC"/>
+            </w:tcBorders>
+            <w:shd w:val="clear" w:color="auto" w:fill="E6F1FB"/>
+          </w:tcPr>
+          <w:p w14:paraId="DL000031">
+            <w:pPr>
+              <w:spacing w:before="60" w:after="60"/>
+            </w:pPr>
+            <w:r>
+              <w:rPr>
+                <w:rFonts w:ascii="Courier New" w:hAnsi="Courier New"/>
+                <w:b/>
+                <w:color w:val="042C53"/>
+                <w:sz w:val="18"/>
+              </w:rPr>
+              <w:t>raw_orderbook_rows</w:t>
+            </w:r>
+          </w:p>
+        </w:tc>
+        <w:tc>
+          <w:tcPr>
+            <w:tcW w:w="2736" w:type="dxa"/>
+            <w:tcBorders>
+              <w:top w:val="single" w:sz="2" w:space="0" w:color="CCCCCC"/>
+              <w:left w:val="single" w:sz="2" w:space="0" w:color="CCCCCC"/>
+              <w:bottom w:val="single" w:sz="2" w:space="0" w:color="CCCCCC"/>
+              <w:right w:val="single" w:sz="2" w:space="0" w:color="CCCCCC"/>
+            </w:tcBorders>
+            <w:shd w:val="clear" w:color="auto" w:fill="FFFFFF"/>
+          </w:tcPr>
+          <w:p w14:paraId="DL000032">
+            <w:pPr>
+              <w:spacing w:before="60" w:after="60"/>
+            </w:pPr>
+            <w:r>
+              <w:rPr>
+                <w:rFonts w:ascii="Courier New" w:hAnsi="Courier New"/>
+                <w:color w:val="3B6D11"/>
+                <w:sz w:val="16"/>
+              </w:rPr>
+              <w:t>list[list[float]]</w:t>
+            </w:r>
+          </w:p>
+        </w:tc>
+        <w:tc>
+          <w:tcPr>
+            <w:tcW w:w="3888" w:type="dxa"/>
+            <w:tcBorders>
+              <w:top w:val="single" w:sz="2" w:space="0" w:color="CCCCCC"/>
+              <w:left w:val="single" w:sz="2" w:space="0" w:color="CCCCCC"/>
+              <w:bottom w:val="single" w:sz="2" w:space="0" w:color="CCCCCC"/>
+              <w:right w:val="single" w:sz="2" w:space="0" w:color="CCCCCC"/>
+            </w:tcBorders>
+            <w:shd w:val="clear" w:color="auto" w:fill="FFFFFF"/>
+          </w:tcPr>
+          <w:p w14:paraId="DL000033">
+            <w:pPr>
+              <w:spacing w:before="60" w:after="60"/>
+            </w:pPr>
+            <w:r>
+              <w:rPr>
+                <w:rFonts w:ascii="Arial" w:hAnsi="Arial"/>
+                <w:color w:val="555555"/>
+                <w:sz w:val="18"/>
+              </w:rPr>
+              <w:t>Raw LOBSTER orderbook rows aligned with message rows</w:t>
+            </w:r>
+          </w:p>
+        </w:tc>
+      </w:tr>
+      <w:tr w14:paraId="DL000040">
+        <w:tc>
+          <w:tcPr>
+            <w:tcW w:w="2736" w:type="dxa"/>
+            <w:tcBorders>
+              <w:top w:val="single" w:sz="2" w:space="0" w:color="CCCCCC"/>
+              <w:left w:val="single" w:sz="2" w:space="0" w:color="CCCCCC"/>
+              <w:bottom w:val="single" w:sz="2" w:space="0" w:color="CCCCCC"/>
+              <w:right w:val="single" w:sz="2" w:space="0" w:color="CCCCCC"/>
+            </w:tcBorders>
+            <w:shd w:val="clear" w:color="auto" w:fill="E6F1FB"/>
+          </w:tcPr>
+          <w:p w14:paraId="DL000041">
+            <w:pPr>
+              <w:spacing w:before="60" w:after="60"/>
+            </w:pPr>
+            <w:r>
+              <w:rPr>
+                <w:rFonts w:ascii="Courier New" w:hAnsi="Courier New"/>
+                <w:b/>
+                <w:color w:val="042C53"/>
+                <w:sz w:val="18"/>
+              </w:rPr>
+              <w:t>special_events</w:t>
+            </w:r>
+          </w:p>
+        </w:tc>
+        <w:tc>
+          <w:tcPr>
+            <w:tcW w:w="2736" w:type="dxa"/>
+            <w:tcBorders>
+              <w:top w:val="single" w:sz="2" w:space="0" w:color="CCCCCC"/>
+              <w:left w:val="single" w:sz="2" w:space="0" w:color="CCCCCC"/>
+              <w:bottom w:val="single" w:sz="2" w:space="0" w:color="CCCCCC"/>
+              <w:right w:val="single" w:sz="2" w:space="0" w:color="CCCCCC"/>
+            </w:tcBorders>
+            <w:shd w:val="clear" w:color="auto" w:fill="FFFFFF"/>
+          </w:tcPr>
+          <w:p w14:paraId="DL000042">
+            <w:pPr>
+              <w:spacing w:before="60" w:after="60"/>
+            </w:pPr>
+            <w:r>
+              <w:rPr>
+                <w:rFonts w:ascii="Courier New" w:hAnsi="Courier New"/>
+                <w:color w:val="3B6D11"/>
+                <w:sz w:val="16"/>
+              </w:rPr>
+              <w:t>list[dict]</w:t>
+            </w:r>
+          </w:p>
+        </w:tc>
+        <w:tc>
+          <w:tcPr>
+            <w:tcW w:w="3888" w:type="dxa"/>
+            <w:tcBorders>
+              <w:top w:val="single" w:sz="2" w:space="0" w:color="CCCCCC"/>
+              <w:left w:val="single" w:sz="2" w:space="0" w:color="CCCCCC"/>
+              <w:bottom w:val="single" w:sz="2" w:space="0" w:color="CCCCCC"/>
+              <w:right w:val="single" w:sz="2" w:space="0" w:color="CCCCCC"/>
+            </w:tcBorders>
+            <w:shd w:val="clear" w:color="auto" w:fill="FFFFFF"/>
+          </w:tcPr>
+          <w:p w14:paraId="DL000043">
+            <w:pPr>
+              <w:spacing w:before="60" w:after="60"/>
+            </w:pPr>
+            <w:r>
+              <w:rPr>
+                <w:rFonts w:ascii="Arial" w:hAnsi="Arial"/>
+                <w:color w:val="555555"/>
+                <w:sz w:val="18"/>
+              </w:rPr>
+              <w:t>Visualization annotations for cross trades (Type 6) and halts (Type 7)</w:t>
             </w:r>
           </w:p>
         </w:tc>
@@ -7720,7 +9438,7 @@
                 <w:color w:val="555555"/>
                 <w:sz w:val="18"/>
               </w:rPr>
-              <w:t>Reads training_data.csv row-by-row; calls _row_to_event; validates timestamps are increasing</w:t>
+              <w:t>Auto-detects internal or LOBSTER format; parses rows into Event objects; sets source_format</w:t>
             </w:r>
           </w:p>
         </w:tc>
@@ -7773,7 +9491,7 @@
                 <w:color w:val="3B6D11"/>
                 <w:sz w:val="16"/>
               </w:rPr>
-              <w:t>(row: dict) -&gt; Event</w:t>
+              <w:t>@staticmethod  (row: dict) -&gt; Event</w:t>
             </w:r>
           </w:p>
         </w:tc>
@@ -7798,7 +9516,7 @@
                 <w:color w:val="555555"/>
                 <w:sz w:val="18"/>
               </w:rPr>
-              <w:t>Maps CSV columns to Event constructor args; raises ValueError on bad rows</w:t>
+              <w:t>Maps internal CSV row dict to Event; raises ValueError on bad data</w:t>
             </w:r>
           </w:p>
         </w:tc>
@@ -8241,7 +9959,7 @@
                 <w:color w:val="3B6D11"/>
                 <w:sz w:val="16"/>
               </w:rPr>
-              <w:t>() -&gt; np.ndarray</w:t>
+              <w:t>(orderbook_path: str | None = None) -&gt; np.ndarray</w:t>
             </w:r>
           </w:p>
         </w:tc>
@@ -8266,7 +9984,319 @@
                 <w:color w:val="555555"/>
                 <w:sz w:val="18"/>
               </w:rPr>
-              <w:t>Converts events list to numpy feature matrix for neural net training</w:t>
+              <w:t>Returns feature matrix from build_training_dataset</w:t>
+            </w:r>
+          </w:p>
+        </w:tc>
+      </w:tr>
+      <w:tr w14:paraId="DL000050">
+        <w:tc>
+          <w:tcPr>
+            <w:tcW w:w="2736" w:type="dxa"/>
+            <w:tcBorders>
+              <w:top w:val="single" w:sz="2" w:space="0" w:color="CCCCCC"/>
+              <w:left w:val="single" w:sz="2" w:space="0" w:color="CCCCCC"/>
+              <w:bottom w:val="single" w:sz="2" w:space="0" w:color="CCCCCC"/>
+              <w:right w:val="single" w:sz="2" w:space="0" w:color="CCCCCC"/>
+            </w:tcBorders>
+            <w:shd w:val="clear" w:color="auto" w:fill="FAEEDA"/>
+          </w:tcPr>
+          <w:p w14:paraId="DL000051">
+            <w:pPr>
+              <w:spacing w:before="60" w:after="60"/>
+            </w:pPr>
+            <w:r>
+              <w:rPr>
+                <w:rFonts w:ascii="Courier New" w:hAnsi="Courier New"/>
+                <w:b/>
+                <w:color w:val="042C53"/>
+                <w:sz w:val="18"/>
+              </w:rPr>
+              <w:t>build_training_dataset</w:t>
+            </w:r>
+          </w:p>
+        </w:tc>
+        <w:tc>
+          <w:tcPr>
+            <w:tcW w:w="2736" w:type="dxa"/>
+            <w:tcBorders>
+              <w:top w:val="single" w:sz="2" w:space="0" w:color="CCCCCC"/>
+              <w:left w:val="single" w:sz="2" w:space="0" w:color="CCCCCC"/>
+              <w:bottom w:val="single" w:sz="2" w:space="0" w:color="CCCCCC"/>
+              <w:right w:val="single" w:sz="2" w:space="0" w:color="CCCCCC"/>
+            </w:tcBorders>
+            <w:shd w:val="clear" w:color="auto" w:fill="FFFFFF"/>
+          </w:tcPr>
+          <w:p w14:paraId="DL000052">
+            <w:pPr>
+              <w:spacing w:before="60" w:after="60"/>
+            </w:pPr>
+            <w:r>
+              <w:rPr>
+                <w:rFonts w:ascii="Courier New" w:hAnsi="Courier New"/>
+                <w:color w:val="3B6D11"/>
+                <w:sz w:val="16"/>
+              </w:rPr>
+              <w:t>(orderbook_path: str | None = None) -&gt; tuple[np.ndarray, np.ndarray]</w:t>
+            </w:r>
+          </w:p>
+        </w:tc>
+        <w:tc>
+          <w:tcPr>
+            <w:tcW w:w="3888" w:type="dxa"/>
+            <w:tcBorders>
+              <w:top w:val="single" w:sz="2" w:space="0" w:color="CCCCCC"/>
+              <w:left w:val="single" w:sz="2" w:space="0" w:color="CCCCCC"/>
+              <w:bottom w:val="single" w:sz="2" w:space="0" w:color="CCCCCC"/>
+              <w:right w:val="single" w:sz="2" w:space="0" w:color="CCCCCC"/>
+            </w:tcBorders>
+            <w:shd w:val="clear" w:color="auto" w:fill="FFFFFF"/>
+          </w:tcPr>
+          <w:p w14:paraId="DL000053">
+            <w:pPr>
+              <w:spacing w:before="60" w:after="60"/>
+            </w:pPr>
+            <w:r>
+              <w:rPr>
+                <w:rFonts w:ascii="Arial" w:hAnsi="Arial"/>
+                <w:color w:val="555555"/>
+                <w:sz w:val="18"/>
+              </w:rPr>
+              <w:t>Replay events or use LOBSTER orderbook rows to produce feature matrix and label vector; result cached</w:t>
+            </w:r>
+          </w:p>
+        </w:tc>
+      </w:tr>
+      <w:tr w14:paraId="DL000060">
+        <w:tc>
+          <w:tcPr>
+            <w:tcW w:w="2736" w:type="dxa"/>
+            <w:tcBorders>
+              <w:top w:val="single" w:sz="2" w:space="0" w:color="CCCCCC"/>
+              <w:left w:val="single" w:sz="2" w:space="0" w:color="CCCCCC"/>
+              <w:bottom w:val="single" w:sz="2" w:space="0" w:color="CCCCCC"/>
+              <w:right w:val="single" w:sz="2" w:space="0" w:color="CCCCCC"/>
+            </w:tcBorders>
+            <w:shd w:val="clear" w:color="auto" w:fill="FAEEDA"/>
+          </w:tcPr>
+          <w:p w14:paraId="DL000061">
+            <w:pPr>
+              <w:spacing w:before="60" w:after="60"/>
+            </w:pPr>
+            <w:r>
+              <w:rPr>
+                <w:rFonts w:ascii="Courier New" w:hAnsi="Courier New"/>
+                <w:b/>
+                <w:color w:val="042C53"/>
+                <w:sz w:val="18"/>
+              </w:rPr>
+              <w:t>to_label_vector</w:t>
+            </w:r>
+          </w:p>
+        </w:tc>
+        <w:tc>
+          <w:tcPr>
+            <w:tcW w:w="2736" w:type="dxa"/>
+            <w:tcBorders>
+              <w:top w:val="single" w:sz="2" w:space="0" w:color="CCCCCC"/>
+              <w:left w:val="single" w:sz="2" w:space="0" w:color="CCCCCC"/>
+              <w:bottom w:val="single" w:sz="2" w:space="0" w:color="CCCCCC"/>
+              <w:right w:val="single" w:sz="2" w:space="0" w:color="CCCCCC"/>
+            </w:tcBorders>
+            <w:shd w:val="clear" w:color="auto" w:fill="FFFFFF"/>
+          </w:tcPr>
+          <w:p w14:paraId="DL000062">
+            <w:pPr>
+              <w:spacing w:before="60" w:after="60"/>
+            </w:pPr>
+            <w:r>
+              <w:rPr>
+                <w:rFonts w:ascii="Courier New" w:hAnsi="Courier New"/>
+                <w:color w:val="3B6D11"/>
+                <w:sz w:val="16"/>
+              </w:rPr>
+              <w:t>(orderbook_path: str | None = None) -&gt; np.ndarray</w:t>
+            </w:r>
+          </w:p>
+        </w:tc>
+        <w:tc>
+          <w:tcPr>
+            <w:tcW w:w="3888" w:type="dxa"/>
+            <w:tcBorders>
+              <w:top w:val="single" w:sz="2" w:space="0" w:color="CCCCCC"/>
+              <w:left w:val="single" w:sz="2" w:space="0" w:color="CCCCCC"/>
+              <w:bottom w:val="single" w:sz="2" w:space="0" w:color="CCCCCC"/>
+              <w:right w:val="single" w:sz="2" w:space="0" w:color="CCCCCC"/>
+            </w:tcBorders>
+            <w:shd w:val="clear" w:color="auto" w:fill="FFFFFF"/>
+          </w:tcPr>
+          <w:p w14:paraId="DL000063">
+            <w:pPr>
+              <w:spacing w:before="60" w:after="60"/>
+            </w:pPr>
+            <w:r>
+              <w:rPr>
+                <w:rFonts w:ascii="Arial" w:hAnsi="Arial"/>
+                <w:color w:val="555555"/>
+                <w:sz w:val="18"/>
+              </w:rPr>
+              <w:t>Returns label vector from build_training_dataset</w:t>
+            </w:r>
+          </w:p>
+        </w:tc>
+      </w:tr>
+      <w:tr w14:paraId="DL000070">
+        <w:tc>
+          <w:tcPr>
+            <w:tcW w:w="2736" w:type="dxa"/>
+            <w:tcBorders>
+              <w:top w:val="single" w:sz="2" w:space="0" w:color="CCCCCC"/>
+              <w:left w:val="single" w:sz="2" w:space="0" w:color="CCCCCC"/>
+              <w:bottom w:val="single" w:sz="2" w:space="0" w:color="CCCCCC"/>
+              <w:right w:val="single" w:sz="2" w:space="0" w:color="CCCCCC"/>
+            </w:tcBorders>
+            <w:shd w:val="clear" w:color="auto" w:fill="FAEEDA"/>
+          </w:tcPr>
+          <w:p w14:paraId="DL000071">
+            <w:pPr>
+              <w:spacing w:before="60" w:after="60"/>
+            </w:pPr>
+            <w:r>
+              <w:rPr>
+                <w:rFonts w:ascii="Courier New" w:hAnsi="Courier New"/>
+                <w:b/>
+                <w:color w:val="042C53"/>
+                <w:sz w:val="18"/>
+              </w:rPr>
+              <w:t>export_training_csv</w:t>
+            </w:r>
+          </w:p>
+        </w:tc>
+        <w:tc>
+          <w:tcPr>
+            <w:tcW w:w="2736" w:type="dxa"/>
+            <w:tcBorders>
+              <w:top w:val="single" w:sz="2" w:space="0" w:color="CCCCCC"/>
+              <w:left w:val="single" w:sz="2" w:space="0" w:color="CCCCCC"/>
+              <w:bottom w:val="single" w:sz="2" w:space="0" w:color="CCCCCC"/>
+              <w:right w:val="single" w:sz="2" w:space="0" w:color="CCCCCC"/>
+            </w:tcBorders>
+            <w:shd w:val="clear" w:color="auto" w:fill="FFFFFF"/>
+          </w:tcPr>
+          <w:p w14:paraId="DL000072">
+            <w:pPr>
+              <w:spacing w:before="60" w:after="60"/>
+            </w:pPr>
+            <w:r>
+              <w:rPr>
+                <w:rFonts w:ascii="Courier New" w:hAnsi="Courier New"/>
+                <w:color w:val="3B6D11"/>
+                <w:sz w:val="16"/>
+              </w:rPr>
+              <w:t>(path: str, orderbook_path: str | None = None) -&gt; None</w:t>
+            </w:r>
+          </w:p>
+        </w:tc>
+        <w:tc>
+          <w:tcPr>
+            <w:tcW w:w="3888" w:type="dxa"/>
+            <w:tcBorders>
+              <w:top w:val="single" w:sz="2" w:space="0" w:color="CCCCCC"/>
+              <w:left w:val="single" w:sz="2" w:space="0" w:color="CCCCCC"/>
+              <w:bottom w:val="single" w:sz="2" w:space="0" w:color="CCCCCC"/>
+              <w:right w:val="single" w:sz="2" w:space="0" w:color="CCCCCC"/>
+            </w:tcBorders>
+            <w:shd w:val="clear" w:color="auto" w:fill="FFFFFF"/>
+          </w:tcPr>
+          <w:p w14:paraId="DL000073">
+            <w:pPr>
+              <w:spacing w:before="60" w:after="60"/>
+            </w:pPr>
+            <w:r>
+              <w:rPr>
+                <w:rFonts w:ascii="Arial" w:hAnsi="Arial"/>
+                <w:color w:val="555555"/>
+                <w:sz w:val="18"/>
+              </w:rPr>
+              <w:t>Writes 13-column CSV: 12 features + label</w:t>
+            </w:r>
+          </w:p>
+        </w:tc>
+      </w:tr>
+      <w:tr w14:paraId="DL000080">
+        <w:tc>
+          <w:tcPr>
+            <w:tcW w:w="2736" w:type="dxa"/>
+            <w:tcBorders>
+              <w:top w:val="single" w:sz="2" w:space="0" w:color="CCCCCC"/>
+              <w:left w:val="single" w:sz="2" w:space="0" w:color="CCCCCC"/>
+              <w:bottom w:val="single" w:sz="2" w:space="0" w:color="CCCCCC"/>
+              <w:right w:val="single" w:sz="2" w:space="0" w:color="CCCCCC"/>
+            </w:tcBorders>
+            <w:shd w:val="clear" w:color="auto" w:fill="FAEEDA"/>
+          </w:tcPr>
+          <w:p w14:paraId="DL000081">
+            <w:pPr>
+              <w:spacing w:before="60" w:after="60"/>
+            </w:pPr>
+            <w:r>
+              <w:rPr>
+                <w:rFonts w:ascii="Courier New" w:hAnsi="Courier New"/>
+                <w:b/>
+                <w:color w:val="042C53"/>
+                <w:sz w:val="18"/>
+              </w:rPr>
+              <w:t>get_visualization_annotations</w:t>
+            </w:r>
+          </w:p>
+        </w:tc>
+        <w:tc>
+          <w:tcPr>
+            <w:tcW w:w="2736" w:type="dxa"/>
+            <w:tcBorders>
+              <w:top w:val="single" w:sz="2" w:space="0" w:color="CCCCCC"/>
+              <w:left w:val="single" w:sz="2" w:space="0" w:color="CCCCCC"/>
+              <w:bottom w:val="single" w:sz="2" w:space="0" w:color="CCCCCC"/>
+              <w:right w:val="single" w:sz="2" w:space="0" w:color="CCCCCC"/>
+            </w:tcBorders>
+            <w:shd w:val="clear" w:color="auto" w:fill="FFFFFF"/>
+          </w:tcPr>
+          <w:p w14:paraId="DL000082">
+            <w:pPr>
+              <w:spacing w:before="60" w:after="60"/>
+            </w:pPr>
+            <w:r>
+              <w:rPr>
+                <w:rFonts w:ascii="Courier New" w:hAnsi="Courier New"/>
+                <w:color w:val="3B6D11"/>
+                <w:sz w:val="16"/>
+              </w:rPr>
+              <w:t>() -&gt; list[dict]</w:t>
+            </w:r>
+          </w:p>
+        </w:tc>
+        <w:tc>
+          <w:tcPr>
+            <w:tcW w:w="3888" w:type="dxa"/>
+            <w:tcBorders>
+              <w:top w:val="single" w:sz="2" w:space="0" w:color="CCCCCC"/>
+              <w:left w:val="single" w:sz="2" w:space="0" w:color="CCCCCC"/>
+              <w:bottom w:val="single" w:sz="2" w:space="0" w:color="CCCCCC"/>
+              <w:right w:val="single" w:sz="2" w:space="0" w:color="CCCCCC"/>
+            </w:tcBorders>
+            <w:shd w:val="clear" w:color="auto" w:fill="FFFFFF"/>
+          </w:tcPr>
+          <w:p w14:paraId="DL000083">
+            <w:pPr>
+              <w:spacing w:before="60" w:after="60"/>
+            </w:pPr>
+            <w:r>
+              <w:rPr>
+                <w:rFonts w:ascii="Arial" w:hAnsi="Arial"/>
+                <w:color w:val="555555"/>
+                <w:sz w:val="18"/>
+              </w:rPr>
+              <w:t>Returns copy of LOBSTER cross-trade and halt annotations</w:t>
             </w:r>
           </w:p>
         </w:tc>
@@ -8277,198 +10307,9 @@
         <w:spacing w:after="40"/>
       </w:pPr>
     </w:p>
-    <w:p>
+    <w:p w14:paraId="7B0ECFC1X">
       <w:pPr>
         <w:spacing w:after="120"/>
-      </w:pPr>
-    </w:p>
-    <w:p>
-      <w:pPr>
-        <w:spacing w:before="120" w:after="40"/>
-      </w:pPr>
-      <w:r>
-        <w:rPr>
-          <w:rFonts w:ascii="Arial" w:hAnsi="Arial"/>
-          <w:b/>
-          <w:color w:val="185FA5"/>
-          <w:sz w:val="18"/>
-        </w:rPr>
-        <w:t>Module-level functions</w:t>
-      </w:r>
-    </w:p>
-    <w:tbl>
-      <w:tblPr>
-        <w:tblStyle w:val="TableGrid"/>
-        <w:tblW w:w="0" w:type="auto"/>
-        <w:tblLook w:val="04A0" w:firstRow="1" w:lastRow="0" w:firstColumn="1" w:lastColumn="0" w:noHBand="0" w:noVBand="1"/>
-      </w:tblPr>
-      <w:tblGrid>
-        <w:gridCol w:w="2736"/>
-        <w:gridCol w:w="2736"/>
-        <w:gridCol w:w="3888"/>
-      </w:tblGrid>
-      <w:tr>
-        <w:tc>
-          <w:tcPr>
-            <w:tcW w:w="2736" w:type="dxa"/>
-            <w:tcBorders>
-              <w:top w:val="single" w:sz="2" w:space="0" w:color="CCCCCC"/>
-              <w:left w:val="single" w:sz="2" w:space="0" w:color="CCCCCC"/>
-              <w:bottom w:val="single" w:sz="2" w:space="0" w:color="CCCCCC"/>
-              <w:right w:val="single" w:sz="2" w:space="0" w:color="CCCCCC"/>
-            </w:tcBorders>
-            <w:shd w:val="clear" w:color="auto" w:fill="FBFBEF"/>
-          </w:tcPr>
-          <w:p>
-            <w:pPr>
-              <w:spacing w:before="60" w:after="60"/>
-            </w:pPr>
-            <w:r>
-              <w:rPr>
-                <w:rFonts w:ascii="Courier New" w:hAnsi="Courier New"/>
-                <w:b/>
-                <w:color w:val="042C53"/>
-                <w:sz w:val="18"/>
-              </w:rPr>
-              <w:t>load_events</w:t>
-            </w:r>
-          </w:p>
-        </w:tc>
-        <w:tc>
-          <w:tcPr>
-            <w:tcW w:w="2736" w:type="dxa"/>
-            <w:tcBorders>
-              <w:top w:val="single" w:sz="2" w:space="0" w:color="CCCCCC"/>
-              <w:left w:val="single" w:sz="2" w:space="0" w:color="CCCCCC"/>
-              <w:bottom w:val="single" w:sz="2" w:space="0" w:color="CCCCCC"/>
-              <w:right w:val="single" w:sz="2" w:space="0" w:color="CCCCCC"/>
-            </w:tcBorders>
-            <w:shd w:val="clear" w:color="auto" w:fill="FFFFFF"/>
-          </w:tcPr>
-          <w:p>
-            <w:pPr>
-              <w:spacing w:before="60" w:after="60"/>
-            </w:pPr>
-            <w:r>
-              <w:rPr>
-                <w:rFonts w:ascii="Courier New" w:hAnsi="Courier New"/>
-                <w:color w:val="3B6D11"/>
-                <w:sz w:val="16"/>
-              </w:rPr>
-              <w:t>(path: str) -&gt; list[Event]</w:t>
-            </w:r>
-          </w:p>
-        </w:tc>
-        <w:tc>
-          <w:tcPr>
-            <w:tcW w:w="3888" w:type="dxa"/>
-            <w:tcBorders>
-              <w:top w:val="single" w:sz="2" w:space="0" w:color="CCCCCC"/>
-              <w:left w:val="single" w:sz="2" w:space="0" w:color="CCCCCC"/>
-              <w:bottom w:val="single" w:sz="2" w:space="0" w:color="CCCCCC"/>
-              <w:right w:val="single" w:sz="2" w:space="0" w:color="CCCCCC"/>
-            </w:tcBorders>
-            <w:shd w:val="clear" w:color="auto" w:fill="FFFFFF"/>
-          </w:tcPr>
-          <w:p>
-            <w:pPr>
-              <w:spacing w:before="60" w:after="60"/>
-            </w:pPr>
-            <w:r>
-              <w:rPr>
-                <w:rFonts w:ascii="Arial" w:hAnsi="Arial"/>
-                <w:color w:val="555555"/>
-                <w:sz w:val="18"/>
-              </w:rPr>
-              <w:t>Convenience wrapper: constructs DataLoader(path), calls load_csv(), returns events</w:t>
-            </w:r>
-          </w:p>
-        </w:tc>
-      </w:tr>
-      <w:tr>
-        <w:tc>
-          <w:tcPr>
-            <w:tcW w:w="2736" w:type="dxa"/>
-            <w:tcBorders>
-              <w:top w:val="single" w:sz="2" w:space="0" w:color="CCCCCC"/>
-              <w:left w:val="single" w:sz="2" w:space="0" w:color="CCCCCC"/>
-              <w:bottom w:val="single" w:sz="2" w:space="0" w:color="CCCCCC"/>
-              <w:right w:val="single" w:sz="2" w:space="0" w:color="CCCCCC"/>
-            </w:tcBorders>
-            <w:shd w:val="clear" w:color="auto" w:fill="FBFBEF"/>
-          </w:tcPr>
-          <w:p>
-            <w:pPr>
-              <w:spacing w:before="60" w:after="60"/>
-            </w:pPr>
-            <w:r>
-              <w:rPr>
-                <w:rFonts w:ascii="Courier New" w:hAnsi="Courier New"/>
-                <w:b/>
-                <w:color w:val="042C53"/>
-                <w:sz w:val="18"/>
-              </w:rPr>
-              <w:t>save_log</w:t>
-            </w:r>
-          </w:p>
-        </w:tc>
-        <w:tc>
-          <w:tcPr>
-            <w:tcW w:w="2736" w:type="dxa"/>
-            <w:tcBorders>
-              <w:top w:val="single" w:sz="2" w:space="0" w:color="CCCCCC"/>
-              <w:left w:val="single" w:sz="2" w:space="0" w:color="CCCCCC"/>
-              <w:bottom w:val="single" w:sz="2" w:space="0" w:color="CCCCCC"/>
-              <w:right w:val="single" w:sz="2" w:space="0" w:color="CCCCCC"/>
-            </w:tcBorders>
-            <w:shd w:val="clear" w:color="auto" w:fill="FFFFFF"/>
-          </w:tcPr>
-          <w:p>
-            <w:pPr>
-              <w:spacing w:before="60" w:after="60"/>
-            </w:pPr>
-            <w:r>
-              <w:rPr>
-                <w:rFonts w:ascii="Courier New" w:hAnsi="Courier New"/>
-                <w:color w:val="3B6D11"/>
-                <w:sz w:val="16"/>
-              </w:rPr>
-              <w:t>(records: list[dict], path: str) -&gt; None</w:t>
-            </w:r>
-          </w:p>
-        </w:tc>
-        <w:tc>
-          <w:tcPr>
-            <w:tcW w:w="3888" w:type="dxa"/>
-            <w:tcBorders>
-              <w:top w:val="single" w:sz="2" w:space="0" w:color="CCCCCC"/>
-              <w:left w:val="single" w:sz="2" w:space="0" w:color="CCCCCC"/>
-              <w:bottom w:val="single" w:sz="2" w:space="0" w:color="CCCCCC"/>
-              <w:right w:val="single" w:sz="2" w:space="0" w:color="CCCCCC"/>
-            </w:tcBorders>
-            <w:shd w:val="clear" w:color="auto" w:fill="FFFFFF"/>
-          </w:tcPr>
-          <w:p>
-            <w:pPr>
-              <w:spacing w:before="60" w:after="60"/>
-            </w:pPr>
-            <w:r>
-              <w:rPr>
-                <w:rFonts w:ascii="Arial" w:hAnsi="Arial"/>
-                <w:color w:val="555555"/>
-                <w:sz w:val="18"/>
-              </w:rPr>
-              <w:t xml:space="preserve">Serialises execution records to log.json with </w:t>
-              <w:lastRenderedPageBreak/>
-              <w:t>json.dump</w:t>
-            </w:r>
-          </w:p>
-        </w:tc>
-      </w:tr>
-    </w:tbl>
-    <w:p>
-      <w:pPr>
-        <w:spacing w:after="40"/>
       </w:pPr>
     </w:p>
     <w:p>
@@ -8501,7 +10342,7 @@
           <w:color w:val="555555"/>
           <w:sz w:val="20"/>
         </w:rPr>
-        <w:t>Normalises raw input into Event objects and streams them to the matching engine.  Also houses the Flask endpoints that ui.js calls over HTTP for live book state, trade history, and metrics.</w:t>
+        <w:t>Sequences Event objects and feeds them to the matching engine. Flask API routes are handled in main.py, not here.</w:t>
       </w:r>
     </w:p>
     <w:p>
@@ -8525,7 +10366,7 @@
           <w:color w:val="555555"/>
           <w:sz w:val="20"/>
         </w:rPr>
-        <w:t xml:space="preserve">  —  EventStream + Flask routes — real-time event pipeline and REST API</w:t>
+        <w:t xml:space="preserve">  —  EventStream — real-time event pipeline and replay engine</w:t>
       </w:r>
     </w:p>
     <w:tbl>
@@ -8652,7 +10493,7 @@
                 <w:color w:val="3B6D11"/>
                 <w:sz w:val="16"/>
               </w:rPr>
-              <w:t>list[Event] | generator</w:t>
+              <w:t>list[Event]</w:t>
             </w:r>
           </w:p>
         </w:tc>
@@ -9433,507 +11274,9 @@
       <w:r>
         <w:rPr>
           <w:rFonts w:ascii="Arial" w:hAnsi="Arial"/>
-          <w:b/>
-          <w:color w:val="185FA5"/>
           <w:sz w:val="18"/>
         </w:rPr>
-        <w:t>Flask API routes  (module-level, registered on app = Flask(__name__))</w:t>
-      </w:r>
-    </w:p>
-    <w:tbl>
-      <w:tblPr>
-        <w:tblStyle w:val="TableGrid"/>
-        <w:tblW w:w="0" w:type="auto"/>
-        <w:tblLook w:val="04A0" w:firstRow="1" w:lastRow="0" w:firstColumn="1" w:lastColumn="0" w:noHBand="0" w:noVBand="1"/>
-      </w:tblPr>
-      <w:tblGrid>
-        <w:gridCol w:w="2736"/>
-        <w:gridCol w:w="2736"/>
-        <w:gridCol w:w="3888"/>
-      </w:tblGrid>
-      <w:tr>
-        <w:tc>
-          <w:tcPr>
-            <w:tcW w:w="2736" w:type="dxa"/>
-            <w:tcBorders>
-              <w:top w:val="single" w:sz="2" w:space="0" w:color="CCCCCC"/>
-              <w:left w:val="single" w:sz="2" w:space="0" w:color="CCCCCC"/>
-              <w:bottom w:val="single" w:sz="2" w:space="0" w:color="CCCCCC"/>
-              <w:right w:val="single" w:sz="2" w:space="0" w:color="CCCCCC"/>
-            </w:tcBorders>
-            <w:shd w:val="clear" w:color="auto" w:fill="FBFBEF"/>
-          </w:tcPr>
-          <w:p>
-            <w:pPr>
-              <w:spacing w:before="60" w:after="60"/>
-            </w:pPr>
-            <w:r>
-              <w:rPr>
-                <w:rFonts w:ascii="Courier New" w:hAnsi="Courier New"/>
-                <w:b/>
-                <w:color w:val="042C53"/>
-                <w:sz w:val="18"/>
-              </w:rPr>
-              <w:t>GET  /api/book</w:t>
-            </w:r>
-          </w:p>
-        </w:tc>
-        <w:tc>
-          <w:tcPr>
-            <w:tcW w:w="2736" w:type="dxa"/>
-            <w:tcBorders>
-              <w:top w:val="single" w:sz="2" w:space="0" w:color="CCCCCC"/>
-              <w:left w:val="single" w:sz="2" w:space="0" w:color="CCCCCC"/>
-              <w:bottom w:val="single" w:sz="2" w:space="0" w:color="CCCCCC"/>
-              <w:right w:val="single" w:sz="2" w:space="0" w:color="CCCCCC"/>
-            </w:tcBorders>
-            <w:shd w:val="clear" w:color="auto" w:fill="FFFFFF"/>
-          </w:tcPr>
-          <w:p>
-            <w:pPr>
-              <w:spacing w:before="60" w:after="60"/>
-            </w:pPr>
-            <w:r>
-              <w:rPr>
-                <w:rFonts w:ascii="Courier New" w:hAnsi="Courier New"/>
-                <w:color w:val="3B6D11"/>
-                <w:sz w:val="16"/>
-              </w:rPr>
-              <w:t>() -&gt; JSON</w:t>
-            </w:r>
-          </w:p>
-        </w:tc>
-        <w:tc>
-          <w:tcPr>
-            <w:tcW w:w="3888" w:type="dxa"/>
-            <w:tcBorders>
-              <w:top w:val="single" w:sz="2" w:space="0" w:color="CCCCCC"/>
-              <w:left w:val="single" w:sz="2" w:space="0" w:color="CCCCCC"/>
-              <w:bottom w:val="single" w:sz="2" w:space="0" w:color="CCCCCC"/>
-              <w:right w:val="single" w:sz="2" w:space="0" w:color="CCCCCC"/>
-            </w:tcBorders>
-            <w:shd w:val="clear" w:color="auto" w:fill="FFFFFF"/>
-          </w:tcPr>
-          <w:p>
-            <w:pPr>
-              <w:spacing w:before="60" w:after="60"/>
-            </w:pPr>
-            <w:r>
-              <w:rPr>
-                <w:rFonts w:ascii="Arial" w:hAnsi="Arial"/>
-                <w:color w:val="555555"/>
-                <w:sz w:val="18"/>
-              </w:rPr>
-              <w:t>Returns depth_snapshot(10) from OrderBook: {bids: [...], asks: [...], spread, mid_price}</w:t>
-            </w:r>
-          </w:p>
-        </w:tc>
-      </w:tr>
-      <w:tr>
-        <w:tc>
-          <w:tcPr>
-            <w:tcW w:w="2736" w:type="dxa"/>
-            <w:tcBorders>
-              <w:top w:val="single" w:sz="2" w:space="0" w:color="CCCCCC"/>
-              <w:left w:val="single" w:sz="2" w:space="0" w:color="CCCCCC"/>
-              <w:bottom w:val="single" w:sz="2" w:space="0" w:color="CCCCCC"/>
-              <w:right w:val="single" w:sz="2" w:space="0" w:color="CCCCCC"/>
-            </w:tcBorders>
-            <w:shd w:val="clear" w:color="auto" w:fill="FBFBEF"/>
-          </w:tcPr>
-          <w:p>
-            <w:pPr>
-              <w:spacing w:before="60" w:after="60"/>
-            </w:pPr>
-            <w:r>
-              <w:rPr>
-                <w:rFonts w:ascii="Courier New" w:hAnsi="Courier New"/>
-                <w:b/>
-                <w:color w:val="042C53"/>
-                <w:sz w:val="18"/>
-              </w:rPr>
-              <w:t>GET  /api/trades</w:t>
-            </w:r>
-          </w:p>
-        </w:tc>
-        <w:tc>
-          <w:tcPr>
-            <w:tcW w:w="2736" w:type="dxa"/>
-            <w:tcBorders>
-              <w:top w:val="single" w:sz="2" w:space="0" w:color="CCCCCC"/>
-              <w:left w:val="single" w:sz="2" w:space="0" w:color="CCCCCC"/>
-              <w:bottom w:val="single" w:sz="2" w:space="0" w:color="CCCCCC"/>
-              <w:right w:val="single" w:sz="2" w:space="0" w:color="CCCCCC"/>
-            </w:tcBorders>
-            <w:shd w:val="clear" w:color="auto" w:fill="FFFFFF"/>
-          </w:tcPr>
-          <w:p>
-            <w:pPr>
-              <w:spacing w:before="60" w:after="60"/>
-            </w:pPr>
-            <w:r>
-              <w:rPr>
-                <w:rFonts w:ascii="Courier New" w:hAnsi="Courier New"/>
-                <w:color w:val="3B6D11"/>
-                <w:sz w:val="16"/>
-              </w:rPr>
-              <w:t>() -&gt; JSON</w:t>
-            </w:r>
-          </w:p>
-        </w:tc>
-        <w:tc>
-          <w:tcPr>
-            <w:tcW w:w="3888" w:type="dxa"/>
-            <w:tcBorders>
-              <w:top w:val="single" w:sz="2" w:space="0" w:color="CCCCCC"/>
-              <w:left w:val="single" w:sz="2" w:space="0" w:color="CCCCCC"/>
-              <w:bottom w:val="single" w:sz="2" w:space="0" w:color="CCCCCC"/>
-              <w:right w:val="single" w:sz="2" w:space="0" w:color="CCCCCC"/>
-            </w:tcBorders>
-            <w:shd w:val="clear" w:color="auto" w:fill="FFFFFF"/>
-          </w:tcPr>
-          <w:p>
-            <w:pPr>
-              <w:spacing w:before="60" w:after="60"/>
-            </w:pPr>
-            <w:r>
-              <w:rPr>
-                <w:rFonts w:ascii="Arial" w:hAnsi="Arial"/>
-                <w:color w:val="555555"/>
-                <w:sz w:val="18"/>
-              </w:rPr>
-              <w:t>Returns recent entries from OrderBook.trade_log as JSON array</w:t>
-            </w:r>
-          </w:p>
-        </w:tc>
-      </w:tr>
-      <w:tr>
-        <w:tc>
-          <w:tcPr>
-            <w:tcW w:w="2736" w:type="dxa"/>
-            <w:tcBorders>
-              <w:top w:val="single" w:sz="2" w:space="0" w:color="CCCCCC"/>
-              <w:left w:val="single" w:sz="2" w:space="0" w:color="CCCCCC"/>
-              <w:bottom w:val="single" w:sz="2" w:space="0" w:color="CCCCCC"/>
-              <w:right w:val="single" w:sz="2" w:space="0" w:color="CCCCCC"/>
-            </w:tcBorders>
-            <w:shd w:val="clear" w:color="auto" w:fill="FBFBEF"/>
-          </w:tcPr>
-          <w:p>
-            <w:pPr>
-              <w:spacing w:before="60" w:after="60"/>
-            </w:pPr>
-            <w:r>
-              <w:rPr>
-                <w:rFonts w:ascii="Courier New" w:hAnsi="Courier New"/>
-                <w:b/>
-                <w:color w:val="042C53"/>
-                <w:sz w:val="18"/>
-              </w:rPr>
-              <w:t>GET  /api/metrics</w:t>
-            </w:r>
-          </w:p>
-        </w:tc>
-        <w:tc>
-          <w:tcPr>
-            <w:tcW w:w="2736" w:type="dxa"/>
-            <w:tcBorders>
-              <w:top w:val="single" w:sz="2" w:space="0" w:color="CCCCCC"/>
-              <w:left w:val="single" w:sz="2" w:space="0" w:color="CCCCCC"/>
-              <w:bottom w:val="single" w:sz="2" w:space="0" w:color="CCCCCC"/>
-              <w:right w:val="single" w:sz="2" w:space="0" w:color="CCCCCC"/>
-            </w:tcBorders>
-            <w:shd w:val="clear" w:color="auto" w:fill="FFFFFF"/>
-          </w:tcPr>
-          <w:p>
-            <w:pPr>
-              <w:spacing w:before="60" w:after="60"/>
-            </w:pPr>
-            <w:r>
-              <w:rPr>
-                <w:rFonts w:ascii="Courier New" w:hAnsi="Courier New"/>
-                <w:color w:val="3B6D11"/>
-                <w:sz w:val="16"/>
-              </w:rPr>
-              <w:t>() -&gt; JSON</w:t>
-            </w:r>
-          </w:p>
-        </w:tc>
-        <w:tc>
-          <w:tcPr>
-            <w:tcW w:w="3888" w:type="dxa"/>
-            <w:tcBorders>
-              <w:top w:val="single" w:sz="2" w:space="0" w:color="CCCCCC"/>
-              <w:left w:val="single" w:sz="2" w:space="0" w:color="CCCCCC"/>
-              <w:bottom w:val="single" w:sz="2" w:space="0" w:color="CCCCCC"/>
-              <w:right w:val="single" w:sz="2" w:space="0" w:color="CCCCCC"/>
-            </w:tcBorders>
-            <w:shd w:val="clear" w:color="auto" w:fill="FFFFFF"/>
-          </w:tcPr>
-          <w:p>
-            <w:pPr>
-              <w:spacing w:before="60" w:after="60"/>
-            </w:pPr>
-            <w:r>
-              <w:rPr>
-                <w:rFonts w:ascii="Arial" w:hAnsi="Arial"/>
-                <w:color w:val="555555"/>
-                <w:sz w:val="18"/>
-              </w:rPr>
-              <w:t>Calls engine.compute_metrics(); returns fill_rate, avg_slippage, execution_cost, P&amp;L</w:t>
-            </w:r>
-          </w:p>
-        </w:tc>
-      </w:tr>
-      <w:tr>
-        <w:tc>
-          <w:tcPr>
-            <w:tcW w:w="2736" w:type="dxa"/>
-            <w:tcBorders>
-              <w:top w:val="single" w:sz="2" w:space="0" w:color="CCCCCC"/>
-              <w:left w:val="single" w:sz="2" w:space="0" w:color="CCCCCC"/>
-              <w:bottom w:val="single" w:sz="2" w:space="0" w:color="CCCCCC"/>
-              <w:right w:val="single" w:sz="2" w:space="0" w:color="CCCCCC"/>
-            </w:tcBorders>
-            <w:shd w:val="clear" w:color="auto" w:fill="FBFBEF"/>
-          </w:tcPr>
-          <w:p>
-            <w:pPr>
-              <w:spacing w:before="60" w:after="60"/>
-            </w:pPr>
-            <w:r>
-              <w:rPr>
-                <w:rFonts w:ascii="Courier New" w:hAnsi="Courier New"/>
-                <w:b/>
-                <w:color w:val="042C53"/>
-                <w:sz w:val="18"/>
-              </w:rPr>
-              <w:t>POST /api/order</w:t>
-            </w:r>
-          </w:p>
-        </w:tc>
-        <w:tc>
-          <w:tcPr>
-            <w:tcW w:w="2736" w:type="dxa"/>
-            <w:tcBorders>
-              <w:top w:val="single" w:sz="2" w:space="0" w:color="CCCCCC"/>
-              <w:left w:val="single" w:sz="2" w:space="0" w:color="CCCCCC"/>
-              <w:bottom w:val="single" w:sz="2" w:space="0" w:color="CCCCCC"/>
-              <w:right w:val="single" w:sz="2" w:space="0" w:color="CCCCCC"/>
-            </w:tcBorders>
-            <w:shd w:val="clear" w:color="auto" w:fill="FFFFFF"/>
-          </w:tcPr>
-          <w:p>
-            <w:pPr>
-              <w:spacing w:before="60" w:after="60"/>
-            </w:pPr>
-            <w:r>
-              <w:rPr>
-                <w:rFonts w:ascii="Courier New" w:hAnsi="Courier New"/>
-                <w:color w:val="3B6D11"/>
-                <w:sz w:val="16"/>
-              </w:rPr>
-              <w:t>(body: Event JSON) -&gt; JSON</w:t>
-            </w:r>
-          </w:p>
-        </w:tc>
-        <w:tc>
-          <w:tcPr>
-            <w:tcW w:w="3888" w:type="dxa"/>
-            <w:tcBorders>
-              <w:top w:val="single" w:sz="2" w:space="0" w:color="CCCCCC"/>
-              <w:left w:val="single" w:sz="2" w:space="0" w:color="CCCCCC"/>
-              <w:bottom w:val="single" w:sz="2" w:space="0" w:color="CCCCCC"/>
-              <w:right w:val="single" w:sz="2" w:space="0" w:color="CCCCCC"/>
-            </w:tcBorders>
-            <w:shd w:val="clear" w:color="auto" w:fill="FFFFFF"/>
-          </w:tcPr>
-          <w:p>
-            <w:pPr>
-              <w:spacing w:before="60" w:after="60"/>
-            </w:pPr>
-            <w:r>
-              <w:rPr>
-                <w:rFonts w:ascii="Arial" w:hAnsi="Arial"/>
-                <w:color w:val="555555"/>
-                <w:sz w:val="18"/>
-              </w:rPr>
-              <w:t>Accepts a new Event from UI; validates; calls stream.emit(); returns fill records</w:t>
-            </w:r>
-          </w:p>
-        </w:tc>
-      </w:tr>
-      <w:tr>
-        <w:tc>
-          <w:tcPr>
-            <w:tcW w:w="2736" w:type="dxa"/>
-            <w:tcBorders>
-              <w:top w:val="single" w:sz="2" w:space="0" w:color="CCCCCC"/>
-              <w:left w:val="single" w:sz="2" w:space="0" w:color="CCCCCC"/>
-              <w:bottom w:val="single" w:sz="2" w:space="0" w:color="CCCCCC"/>
-              <w:right w:val="single" w:sz="2" w:space="0" w:color="CCCCCC"/>
-            </w:tcBorders>
-            <w:shd w:val="clear" w:color="auto" w:fill="FBFBEF"/>
-          </w:tcPr>
-          <w:p>
-            <w:pPr>
-              <w:spacing w:before="60" w:after="60"/>
-            </w:pPr>
-            <w:r>
-              <w:rPr>
-                <w:rFonts w:ascii="Courier New" w:hAnsi="Courier New"/>
-                <w:b/>
-                <w:color w:val="042C53"/>
-                <w:sz w:val="18"/>
-              </w:rPr>
-              <w:t>POST /api/cancel</w:t>
-            </w:r>
-          </w:p>
-        </w:tc>
-        <w:tc>
-          <w:tcPr>
-            <w:tcW w:w="2736" w:type="dxa"/>
-            <w:tcBorders>
-              <w:top w:val="single" w:sz="2" w:space="0" w:color="CCCCCC"/>
-              <w:left w:val="single" w:sz="2" w:space="0" w:color="CCCCCC"/>
-              <w:bottom w:val="single" w:sz="2" w:space="0" w:color="CCCCCC"/>
-              <w:right w:val="single" w:sz="2" w:space="0" w:color="CCCCCC"/>
-            </w:tcBorders>
-            <w:shd w:val="clear" w:color="auto" w:fill="FFFFFF"/>
-          </w:tcPr>
-          <w:p>
-            <w:pPr>
-              <w:spacing w:before="60" w:after="60"/>
-            </w:pPr>
-            <w:r>
-              <w:rPr>
-                <w:rFonts w:ascii="Courier New" w:hAnsi="Courier New"/>
-                <w:color w:val="3B6D11"/>
-                <w:sz w:val="16"/>
-              </w:rPr>
-              <w:t>(body: {order_id}) -&gt; JSON</w:t>
-            </w:r>
-          </w:p>
-        </w:tc>
-        <w:tc>
-          <w:tcPr>
-            <w:tcW w:w="3888" w:type="dxa"/>
-            <w:tcBorders>
-              <w:top w:val="single" w:sz="2" w:space="0" w:color="CCCCCC"/>
-              <w:left w:val="single" w:sz="2" w:space="0" w:color="CCCCCC"/>
-              <w:bottom w:val="single" w:sz="2" w:space="0" w:color="CCCCCC"/>
-              <w:right w:val="single" w:sz="2" w:space="0" w:color="CCCCCC"/>
-            </w:tcBorders>
-            <w:shd w:val="clear" w:color="auto" w:fill="FFFFFF"/>
-          </w:tcPr>
-          <w:p>
-            <w:pPr>
-              <w:spacing w:before="60" w:after="60"/>
-            </w:pPr>
-            <w:r>
-              <w:rPr>
-                <w:rFonts w:ascii="Arial" w:hAnsi="Arial"/>
-                <w:color w:val="555555"/>
-                <w:sz w:val="18"/>
-              </w:rPr>
-              <w:t xml:space="preserve">Cancels order by ID; returns {success: bool, </w:t>
-              <w:lastRenderedPageBreak/>
-              <w:t>message}</w:t>
-            </w:r>
-          </w:p>
-        </w:tc>
-      </w:tr>
-      <w:tr>
-        <w:tc>
-          <w:tcPr>
-            <w:tcW w:w="2736" w:type="dxa"/>
-            <w:tcBorders>
-              <w:top w:val="single" w:sz="2" w:space="0" w:color="CCCCCC"/>
-              <w:left w:val="single" w:sz="2" w:space="0" w:color="CCCCCC"/>
-              <w:bottom w:val="single" w:sz="2" w:space="0" w:color="CCCCCC"/>
-              <w:right w:val="single" w:sz="2" w:space="0" w:color="CCCCCC"/>
-            </w:tcBorders>
-            <w:shd w:val="clear" w:color="auto" w:fill="FBFBEF"/>
-          </w:tcPr>
-          <w:p>
-            <w:pPr>
-              <w:spacing w:before="60" w:after="60"/>
-            </w:pPr>
-            <w:r>
-              <w:rPr>
-                <w:rFonts w:ascii="Courier New" w:hAnsi="Courier New"/>
-                <w:b/>
-                <w:color w:val="042C53"/>
-                <w:sz w:val="18"/>
-              </w:rPr>
-              <w:lastRenderedPageBreak/>
-              <w:t>GET  /api/scenario</w:t>
-            </w:r>
-          </w:p>
-        </w:tc>
-        <w:tc>
-          <w:tcPr>
-            <w:tcW w:w="2736" w:type="dxa"/>
-            <w:tcBorders>
-              <w:top w:val="single" w:sz="2" w:space="0" w:color="CCCCCC"/>
-              <w:left w:val="single" w:sz="2" w:space="0" w:color="CCCCCC"/>
-              <w:bottom w:val="single" w:sz="2" w:space="0" w:color="CCCCCC"/>
-              <w:right w:val="single" w:sz="2" w:space="0" w:color="CCCCCC"/>
-            </w:tcBorders>
-            <w:shd w:val="clear" w:color="auto" w:fill="FFFFFF"/>
-          </w:tcPr>
-          <w:p>
-            <w:pPr>
-              <w:spacing w:before="60" w:after="60"/>
-            </w:pPr>
-            <w:r>
-              <w:rPr>
-                <w:rFonts w:ascii="Courier New" w:hAnsi="Courier New"/>
-                <w:color w:val="3B6D11"/>
-                <w:sz w:val="16"/>
-              </w:rPr>
-              <w:t>(?scenario=str) -&gt; JSON</w:t>
-            </w:r>
-          </w:p>
-        </w:tc>
-        <w:tc>
-          <w:tcPr>
-            <w:tcW w:w="3888" w:type="dxa"/>
-            <w:tcBorders>
-              <w:top w:val="single" w:sz="2" w:space="0" w:color="CCCCCC"/>
-              <w:left w:val="single" w:sz="2" w:space="0" w:color="CCCCCC"/>
-              <w:bottom w:val="single" w:sz="2" w:space="0" w:color="CCCCCC"/>
-              <w:right w:val="single" w:sz="2" w:space="0" w:color="CCCCCC"/>
-            </w:tcBorders>
-            <w:shd w:val="clear" w:color="auto" w:fill="FFFFFF"/>
-          </w:tcPr>
-          <w:p>
-            <w:pPr>
-              <w:spacing w:before="60" w:after="60"/>
-            </w:pPr>
-            <w:r>
-              <w:rPr>
-                <w:rFonts w:ascii="Arial" w:hAnsi="Arial"/>
-                <w:color w:val="555555"/>
-                <w:sz w:val="18"/>
-              </w:rPr>
-              <w:t>Triggers DataLoader.generate_synthetic(scenario); replays through engine; returns summary metrics</w:t>
-            </w:r>
-          </w:p>
-        </w:tc>
-      </w:tr>
-    </w:tbl>
-    <w:p>
-      <w:pPr>
-        <w:spacing w:after="40"/>
-      </w:pPr>
-      <w:r>
-        <w:rPr>
-          <w:rFonts w:ascii="Arial" w:hAnsi="Arial"/>
-          <w:color w:val="CC0000"/>
-          <w:sz w:val="18"/>
-        </w:rPr>
-        <w:t>⚠ Flask routes are defined in the class reference architecture but are NOT yet implemented in the current event_stream.py source file.</w:t>
+        <w:t>Flask API routes are implemented in main.py, not in this module. EventStream is responsible only for sequencing and emitting events.</w:t>
       </w:r>
     </w:p>
     <w:p>
@@ -12100,6 +13443,84 @@
           </w:p>
         </w:tc>
       </w:tr>
+      <w:tr>
+        <w:tc>
+          <w:tcPr>
+            <w:tcW w:w="2736" w:type="dxa"/>
+            <w:tcBorders>
+              <w:top w:val="single" w:sz="2" w:space="0" w:color="CCCCCC"/>
+              <w:left w:val="single" w:sz="2" w:space="0" w:color="CCCCCC"/>
+              <w:bottom w:val="single" w:sz="2" w:space="0" w:color="CCCCCC"/>
+              <w:right w:val="single" w:sz="2" w:space="0" w:color="CCCCCC"/>
+            </w:tcBorders>
+            <w:shd w:val="clear" w:color="auto" w:fill="E6F1FB"/>
+          </w:tcPr>
+          <w:p>
+            <w:pPr>
+              <w:spacing w:before="60" w:after="60"/>
+            </w:pPr>
+            <w:r>
+              <w:rPr>
+                <w:rFonts w:ascii="Courier New" w:hAnsi="Courier New"/>
+                <w:b/>
+                <w:color w:val="042C53"/>
+                <w:sz w:val="18"/>
+              </w:rPr>
+              <w:t>model_loaded</w:t>
+            </w:r>
+          </w:p>
+        </w:tc>
+        <w:tc>
+          <w:tcPr>
+            <w:tcW w:w="2736" w:type="dxa"/>
+            <w:tcBorders>
+              <w:top w:val="single" w:sz="2" w:space="0" w:color="CCCCCC"/>
+              <w:left w:val="single" w:sz="2" w:space="0" w:color="CCCCCC"/>
+              <w:bottom w:val="single" w:sz="2" w:space="0" w:color="CCCCCC"/>
+              <w:right w:val="single" w:sz="2" w:space="0" w:color="CCCCCC"/>
+            </w:tcBorders>
+            <w:shd w:val="clear" w:color="auto" w:fill="FFFFFF"/>
+          </w:tcPr>
+          <w:p>
+            <w:pPr>
+              <w:spacing w:before="60" w:after="60"/>
+            </w:pPr>
+            <w:r>
+              <w:rPr>
+                <w:rFonts w:ascii="Courier New" w:hAnsi="Courier New"/>
+                <w:color w:val="3B6D11"/>
+                <w:sz w:val="16"/>
+              </w:rPr>
+              <w:t>bool</w:t>
+            </w:r>
+          </w:p>
+        </w:tc>
+        <w:tc>
+          <w:tcPr>
+            <w:tcW w:w="3888" w:type="dxa"/>
+            <w:tcBorders>
+              <w:top w:val="single" w:sz="2" w:space="0" w:color="CCCCCC"/>
+              <w:left w:val="single" w:sz="2" w:space="0" w:color="CCCCCC"/>
+              <w:bottom w:val="single" w:sz="2" w:space="0" w:color="CCCCCC"/>
+              <w:right w:val="single" w:sz="2" w:space="0" w:color="CCCCCC"/>
+            </w:tcBorders>
+            <w:shd w:val="clear" w:color="auto" w:fill="FFFFFF"/>
+          </w:tcPr>
+          <w:p>
+            <w:pPr>
+              <w:spacing w:before="60" w:after="60"/>
+            </w:pPr>
+            <w:r>
+              <w:rPr>
+                <w:rFonts w:ascii="Arial" w:hAnsi="Arial"/>
+                <w:color w:val="555555"/>
+                <w:sz w:val="18"/>
+              </w:rPr>
+              <w:t>True if a checkpoint was successfully loaded from model_path; False if file was missing or load failed</w:t>
+            </w:r>
+          </w:p>
+        </w:tc>
+      </w:tr>
     </w:tbl>
     <w:p>
       <w:pPr>
@@ -12282,7 +13703,7 @@
                 <w:color w:val="555555"/>
                 <w:sz w:val="18"/>
               </w:rPr>
-              <w:t>Extracts feature vector from book snapshot: spread, depth, mid_price, imbalance, etc.</w:t>
+              <w:t>@staticmethod; delegates to build_features(book)</w:t>
             </w:r>
           </w:p>
         </w:tc>
@@ -12630,7 +14051,7 @@
                 <w:color w:val="555555"/>
                 <w:sz w:val="18"/>
               </w:rPr>
-              <w:t>Standalone feature extractor: best_bid, best_ask, spread, depth[0..4], mid, imbalance (12 dims)</w:t>
+              <w:t>Returns 12-D feature vector via DataLoader._feature_vector_from_levels; components: best_bid_price, best_bid_size, best_ask_price, best_ask_size, spread, mid_price, imbalance, bid_price_2, bid_size_2, ask_price_2, ask_size_2, event_side</w:t>
             </w:r>
           </w:p>
         </w:tc>
@@ -12683,7 +14104,7 @@
                 <w:color w:val="3B6D11"/>
                 <w:sz w:val="16"/>
               </w:rPr>
-              <w:t>(path: str) -&gt; Agent</w:t>
+              <w:t>(path: str) -&gt; Agent | None</w:t>
             </w:r>
           </w:p>
         </w:tc>
@@ -12708,7 +14129,7 @@
                 <w:color w:val="555555"/>
                 <w:sz w:val="18"/>
               </w:rPr>
-              <w:t>Constructs Agent and loads weights; ready for inference</w:t>
+              <w:t>Constructs Agent and loads weights; returns None if file missing or weights fail to load</w:t>
             </w:r>
           </w:p>
         </w:tc>
@@ -15481,7 +16902,7 @@
                 <w:color w:val="3B6D11"/>
                 <w:sz w:val="16"/>
               </w:rPr>
-              <w:t>float</w:t>
+              <w:t>str (ISO datetime)</w:t>
             </w:r>
           </w:p>
         </w:tc>
@@ -15506,7 +16927,7 @@
                 <w:color w:val="555555"/>
                 <w:sz w:val="18"/>
               </w:rPr>
-              <w:t>Unix epoch; rows must be sorted ascending</w:t>
+              <w:t>ISO 8601 datetime string; rows must be sorted ascending</w:t>
             </w:r>
           </w:p>
         </w:tc>
@@ -16482,84 +17903,6 @@
                 <w:sz w:val="18"/>
               </w:rPr>
               <w:t>Taker remaining after this fill</w:t>
-            </w:r>
-          </w:p>
-        </w:tc>
-      </w:tr>
-      <w:tr>
-        <w:tc>
-          <w:tcPr>
-            <w:tcW w:w="2736" w:type="dxa"/>
-            <w:tcBorders>
-              <w:top w:val="single" w:sz="2" w:space="0" w:color="CCCCCC"/>
-              <w:left w:val="single" w:sz="2" w:space="0" w:color="CCCCCC"/>
-              <w:bottom w:val="single" w:sz="2" w:space="0" w:color="CCCCCC"/>
-              <w:right w:val="single" w:sz="2" w:space="0" w:color="CCCCCC"/>
-            </w:tcBorders>
-            <w:shd w:val="clear" w:color="auto" w:fill="F1EFE8"/>
-          </w:tcPr>
-          <w:p>
-            <w:pPr>
-              <w:spacing w:before="60" w:after="60"/>
-            </w:pPr>
-            <w:r>
-              <w:rPr>
-                <w:rFonts w:ascii="Courier New" w:hAnsi="Courier New"/>
-                <w:b/>
-                <w:color w:val="042C53"/>
-                <w:sz w:val="18"/>
-              </w:rPr>
-              <w:t>slippage</w:t>
-            </w:r>
-          </w:p>
-        </w:tc>
-        <w:tc>
-          <w:tcPr>
-            <w:tcW w:w="2736" w:type="dxa"/>
-            <w:tcBorders>
-              <w:top w:val="single" w:sz="2" w:space="0" w:color="CCCCCC"/>
-              <w:left w:val="single" w:sz="2" w:space="0" w:color="CCCCCC"/>
-              <w:bottom w:val="single" w:sz="2" w:space="0" w:color="CCCCCC"/>
-              <w:right w:val="single" w:sz="2" w:space="0" w:color="CCCCCC"/>
-            </w:tcBorders>
-            <w:shd w:val="clear" w:color="auto" w:fill="FFFFFF"/>
-          </w:tcPr>
-          <w:p>
-            <w:pPr>
-              <w:spacing w:before="60" w:after="60"/>
-            </w:pPr>
-            <w:r>
-              <w:rPr>
-                <w:rFonts w:ascii="Courier New" w:hAnsi="Courier New"/>
-                <w:color w:val="3B6D11"/>
-                <w:sz w:val="16"/>
-              </w:rPr>
-              <w:t>float</w:t>
-            </w:r>
-          </w:p>
-        </w:tc>
-        <w:tc>
-          <w:tcPr>
-            <w:tcW w:w="3888" w:type="dxa"/>
-            <w:tcBorders>
-              <w:top w:val="single" w:sz="2" w:space="0" w:color="CCCCCC"/>
-              <w:left w:val="single" w:sz="2" w:space="0" w:color="CCCCCC"/>
-              <w:bottom w:val="single" w:sz="2" w:space="0" w:color="CCCCCC"/>
-              <w:right w:val="single" w:sz="2" w:space="0" w:color="CCCCCC"/>
-            </w:tcBorders>
-            <w:shd w:val="clear" w:color="auto" w:fill="FFFFFF"/>
-          </w:tcPr>
-          <w:p>
-            <w:pPr>
-              <w:spacing w:before="60" w:after="60"/>
-            </w:pPr>
-            <w:r>
-              <w:rPr>
-                <w:rFonts w:ascii="Arial" w:hAnsi="Arial"/>
-                <w:color w:val="555555"/>
-                <w:sz w:val="18"/>
-              </w:rPr>
-              <w:t>exec_price minus expected_price</w:t>
             </w:r>
           </w:p>
         </w:tc>
@@ -16802,7 +18145,7 @@
                 <w:color w:val="555555"/>
                 <w:sz w:val="18"/>
               </w:rPr>
-              <w:t>Event, Order objects</w:t>
+              <w:t>Event, BaseOrder, IncomingOrder, Order objects</w:t>
             </w:r>
           </w:p>
         </w:tc>
@@ -17168,7 +18511,7 @@
                 <w:color w:val="555555"/>
                 <w:sz w:val="18"/>
               </w:rPr>
-              <w:t>orders.py, numpy, csv</w:t>
+              <w:t>orders.py, matching_engine.py, order_book.py, numpy, csv</w:t>
             </w:r>
           </w:p>
         </w:tc>
@@ -17349,7 +18692,7 @@
                 <w:color w:val="555555"/>
                 <w:sz w:val="18"/>
               </w:rPr>
-              <w:t>Flask API, emitted fills</w:t>
+              <w:t>emitted fills</w:t>
             </w:r>
           </w:p>
         </w:tc>
@@ -17402,7 +18745,7 @@
                 <w:color w:val="555555"/>
                 <w:sz w:val="18"/>
               </w:rPr>
-              <w:t>all modules above</w:t>
+              <w:t>all modules above, flask</w:t>
             </w:r>
           </w:p>
         </w:tc>

</xml_diff>